<commit_message>
Power BI Data Analytics Document
</commit_message>
<xml_diff>
--- a/Power_BI_Data_Analytics.docx
+++ b/Power_BI_Data_Analytics.docx
@@ -9,6 +9,8 @@
         <w:rPr>
           <w:b/>
           <w:bCs/>
+          <w:sz w:val="20"/>
+          <w:szCs w:val="20"/>
           <w:u w:val="single"/>
         </w:rPr>
       </w:pPr>
@@ -16,6 +18,8 @@
         <w:rPr>
           <w:b/>
           <w:bCs/>
+          <w:sz w:val="20"/>
+          <w:szCs w:val="20"/>
           <w:u w:val="single"/>
         </w:rPr>
         <w:t>Power BI Data Analytics</w:t>
@@ -28,6 +32,8 @@
         <w:rPr>
           <w:b/>
           <w:bCs/>
+          <w:sz w:val="20"/>
+          <w:szCs w:val="20"/>
           <w:u w:val="single"/>
         </w:rPr>
       </w:pPr>
@@ -35,6 +41,8 @@
         <w:rPr>
           <w:b/>
           <w:bCs/>
+          <w:sz w:val="20"/>
+          <w:szCs w:val="20"/>
           <w:u w:val="single"/>
         </w:rPr>
         <w:t>3/1/2026</w:t>
@@ -46,6 +54,8 @@
         <w:rPr>
           <w:b/>
           <w:bCs/>
+          <w:sz w:val="20"/>
+          <w:szCs w:val="20"/>
           <w:u w:val="single"/>
         </w:rPr>
       </w:pPr>
@@ -53,6 +63,8 @@
         <w:rPr>
           <w:b/>
           <w:bCs/>
+          <w:sz w:val="20"/>
+          <w:szCs w:val="20"/>
           <w:u w:val="single"/>
         </w:rPr>
         <w:t>Objective</w:t>
@@ -61,6 +73,8 @@
         <w:rPr>
           <w:b/>
           <w:bCs/>
+          <w:sz w:val="20"/>
+          <w:szCs w:val="20"/>
           <w:u w:val="single"/>
         </w:rPr>
         <w:t>:</w:t>
@@ -73,12 +87,17 @@
           <w:ilvl w:val="0"/>
           <w:numId w:val="4"/>
         </w:numPr>
-      </w:pPr>
-      <w:r>
-        <w:t xml:space="preserve">Install </w:t>
-      </w:r>
-      <w:r>
-        <w:t xml:space="preserve">&amp; config SQL Server &amp; SSMS </w:t>
+        <w:rPr>
+          <w:sz w:val="20"/>
+          <w:szCs w:val="20"/>
+        </w:rPr>
+      </w:pPr>
+      <w:r>
+        <w:rPr>
+          <w:sz w:val="20"/>
+          <w:szCs w:val="20"/>
+        </w:rPr>
+        <w:t xml:space="preserve">Install &amp; config SQL Server &amp; SSMS </w:t>
       </w:r>
     </w:p>
     <w:p>
@@ -88,8 +107,16 @@
           <w:ilvl w:val="0"/>
           <w:numId w:val="4"/>
         </w:numPr>
-      </w:pPr>
-      <w:r>
+        <w:rPr>
+          <w:sz w:val="20"/>
+          <w:szCs w:val="20"/>
+        </w:rPr>
+      </w:pPr>
+      <w:r>
+        <w:rPr>
+          <w:sz w:val="20"/>
+          <w:szCs w:val="20"/>
+        </w:rPr>
         <w:t>Implementing data import techniques from various sources into SQL Server and Power BI</w:t>
       </w:r>
     </w:p>
@@ -100,8 +127,16 @@
           <w:ilvl w:val="0"/>
           <w:numId w:val="4"/>
         </w:numPr>
-      </w:pPr>
-      <w:r>
+        <w:rPr>
+          <w:sz w:val="20"/>
+          <w:szCs w:val="20"/>
+        </w:rPr>
+      </w:pPr>
+      <w:r>
+        <w:rPr>
+          <w:sz w:val="20"/>
+          <w:szCs w:val="20"/>
+        </w:rPr>
         <w:t>Applying data profiling and cleaning methods to ensure data quality and consistency</w:t>
       </w:r>
     </w:p>
@@ -112,8 +147,16 @@
           <w:ilvl w:val="0"/>
           <w:numId w:val="4"/>
         </w:numPr>
-      </w:pPr>
-      <w:r>
+        <w:rPr>
+          <w:sz w:val="20"/>
+          <w:szCs w:val="20"/>
+        </w:rPr>
+      </w:pPr>
+      <w:r>
+        <w:rPr>
+          <w:sz w:val="20"/>
+          <w:szCs w:val="20"/>
+        </w:rPr>
         <w:t>Building calculated columns and custom measures using Data Analysis Expression (DAX) in Power BI</w:t>
       </w:r>
     </w:p>
@@ -124,8 +167,16 @@
           <w:ilvl w:val="0"/>
           <w:numId w:val="4"/>
         </w:numPr>
-      </w:pPr>
-      <w:r>
+        <w:rPr>
+          <w:sz w:val="20"/>
+          <w:szCs w:val="20"/>
+        </w:rPr>
+      </w:pPr>
+      <w:r>
+        <w:rPr>
+          <w:sz w:val="20"/>
+          <w:szCs w:val="20"/>
+        </w:rPr>
         <w:t xml:space="preserve">Analyzing sales, returns, and inventory data to identify trends and patterns </w:t>
       </w:r>
     </w:p>
@@ -136,8 +187,16 @@
           <w:ilvl w:val="0"/>
           <w:numId w:val="4"/>
         </w:numPr>
-      </w:pPr>
-      <w:r>
+        <w:rPr>
+          <w:sz w:val="20"/>
+          <w:szCs w:val="20"/>
+        </w:rPr>
+      </w:pPr>
+      <w:r>
+        <w:rPr>
+          <w:sz w:val="20"/>
+          <w:szCs w:val="20"/>
+        </w:rPr>
         <w:t xml:space="preserve">Designing interactive Power BI reports with effective visualizations to communicate insights </w:t>
       </w:r>
     </w:p>
@@ -148,8 +207,16 @@
           <w:ilvl w:val="0"/>
           <w:numId w:val="4"/>
         </w:numPr>
-      </w:pPr>
-      <w:r>
+        <w:rPr>
+          <w:sz w:val="20"/>
+          <w:szCs w:val="20"/>
+        </w:rPr>
+      </w:pPr>
+      <w:r>
+        <w:rPr>
+          <w:sz w:val="20"/>
+          <w:szCs w:val="20"/>
+        </w:rPr>
         <w:t>Optimizing Power BI reports for performance and accessibility</w:t>
       </w:r>
     </w:p>
@@ -159,6 +226,8 @@
         <w:rPr>
           <w:b/>
           <w:bCs/>
+          <w:sz w:val="20"/>
+          <w:szCs w:val="20"/>
           <w:u w:val="single"/>
         </w:rPr>
       </w:pPr>
@@ -169,6 +238,8 @@
         <w:rPr>
           <w:b/>
           <w:bCs/>
+          <w:sz w:val="20"/>
+          <w:szCs w:val="20"/>
           <w:u w:val="single"/>
         </w:rPr>
       </w:pPr>
@@ -176,27 +247,63 @@
         <w:rPr>
           <w:b/>
           <w:bCs/>
+          <w:sz w:val="20"/>
+          <w:szCs w:val="20"/>
           <w:u w:val="single"/>
         </w:rPr>
-        <w:t>Project Architecture:</w:t>
-      </w:r>
-    </w:p>
-    <w:p>
-      <w:pPr>
-        <w:pStyle w:val="NoSpacing"/>
+        <w:t>High-level system</w:t>
+      </w:r>
+      <w:r>
         <w:rPr>
           <w:b/>
           <w:bCs/>
+          <w:sz w:val="20"/>
+          <w:szCs w:val="20"/>
           <w:u w:val="single"/>
         </w:rPr>
-      </w:pPr>
-    </w:p>
-    <w:p>
-      <w:pPr>
-        <w:pStyle w:val="NoSpacing"/>
+        <w:t xml:space="preserve"> </w:t>
+      </w:r>
+      <w:r>
         <w:rPr>
           <w:b/>
           <w:bCs/>
+          <w:sz w:val="20"/>
+          <w:szCs w:val="20"/>
+          <w:u w:val="single"/>
+        </w:rPr>
+        <w:t>a</w:t>
+      </w:r>
+      <w:r>
+        <w:rPr>
+          <w:b/>
+          <w:bCs/>
+          <w:sz w:val="20"/>
+          <w:szCs w:val="20"/>
+          <w:u w:val="single"/>
+        </w:rPr>
+        <w:t>rchitecture:</w:t>
+      </w:r>
+    </w:p>
+    <w:p>
+      <w:pPr>
+        <w:pStyle w:val="NoSpacing"/>
+        <w:rPr>
+          <w:b/>
+          <w:bCs/>
+          <w:sz w:val="20"/>
+          <w:szCs w:val="20"/>
+          <w:u w:val="single"/>
+        </w:rPr>
+      </w:pPr>
+    </w:p>
+    <w:p>
+      <w:pPr>
+        <w:pStyle w:val="NoSpacing"/>
+        <w:rPr>
+          <w:b/>
+          <w:bCs/>
+          <w:sz w:val="20"/>
+          <w:szCs w:val="20"/>
           <w:u w:val="single"/>
         </w:rPr>
       </w:pPr>
@@ -205,6 +312,8 @@
           <w:b/>
           <w:bCs/>
           <w:noProof/>
+          <w:sz w:val="20"/>
+          <w:szCs w:val="20"/>
           <w:u w:val="single"/>
         </w:rPr>
         <w:drawing>
@@ -263,6 +372,8 @@
         <w:rPr>
           <w:b/>
           <w:bCs/>
+          <w:sz w:val="20"/>
+          <w:szCs w:val="20"/>
           <w:u w:val="single"/>
         </w:rPr>
       </w:pPr>
@@ -273,6 +384,8 @@
         <w:rPr>
           <w:b/>
           <w:bCs/>
+          <w:sz w:val="20"/>
+          <w:szCs w:val="20"/>
           <w:u w:val="single"/>
         </w:rPr>
       </w:pPr>
@@ -280,6 +393,8 @@
         <w:rPr>
           <w:b/>
           <w:bCs/>
+          <w:sz w:val="20"/>
+          <w:szCs w:val="20"/>
           <w:u w:val="single"/>
         </w:rPr>
         <w:t>Tech stack:</w:t>
@@ -292,8 +407,16 @@
           <w:ilvl w:val="0"/>
           <w:numId w:val="3"/>
         </w:numPr>
-      </w:pPr>
-      <w:r>
+        <w:rPr>
+          <w:sz w:val="20"/>
+          <w:szCs w:val="20"/>
+        </w:rPr>
+      </w:pPr>
+      <w:r>
+        <w:rPr>
+          <w:sz w:val="20"/>
+          <w:szCs w:val="20"/>
+        </w:rPr>
         <w:t>Microsoft Power BI Desktop</w:t>
       </w:r>
     </w:p>
@@ -304,9 +427,24 @@
           <w:ilvl w:val="0"/>
           <w:numId w:val="3"/>
         </w:numPr>
-      </w:pPr>
-      <w:r>
-        <w:t xml:space="preserve">SQL Server Management Studio (SSMS) </w:t>
+        <w:rPr>
+          <w:sz w:val="20"/>
+          <w:szCs w:val="20"/>
+        </w:rPr>
+      </w:pPr>
+      <w:r>
+        <w:rPr>
+          <w:sz w:val="20"/>
+          <w:szCs w:val="20"/>
+        </w:rPr>
+        <w:t xml:space="preserve">SQL Server </w:t>
+      </w:r>
+      <w:r>
+        <w:rPr>
+          <w:sz w:val="20"/>
+          <w:szCs w:val="20"/>
+        </w:rPr>
+        <w:t>2025</w:t>
       </w:r>
     </w:p>
     <w:p>
@@ -316,11 +454,50 @@
           <w:ilvl w:val="0"/>
           <w:numId w:val="3"/>
         </w:numPr>
-      </w:pPr>
-      <w:r>
+        <w:rPr>
+          <w:sz w:val="20"/>
+          <w:szCs w:val="20"/>
+        </w:rPr>
+      </w:pPr>
+      <w:r>
+        <w:rPr>
+          <w:sz w:val="20"/>
+          <w:szCs w:val="20"/>
+        </w:rPr>
+        <w:t xml:space="preserve">SQL Server Management Studio (SSMS) </w:t>
+      </w:r>
+      <w:r>
+        <w:rPr>
+          <w:sz w:val="20"/>
+          <w:szCs w:val="20"/>
+        </w:rPr>
+        <w:t>22.2.1</w:t>
+      </w:r>
+    </w:p>
+    <w:p>
+      <w:pPr>
+        <w:pStyle w:val="NoSpacing"/>
+        <w:numPr>
+          <w:ilvl w:val="0"/>
+          <w:numId w:val="3"/>
+        </w:numPr>
+        <w:rPr>
+          <w:sz w:val="20"/>
+          <w:szCs w:val="20"/>
+        </w:rPr>
+      </w:pPr>
+      <w:r>
+        <w:rPr>
+          <w:sz w:val="20"/>
+          <w:szCs w:val="20"/>
+        </w:rPr>
         <w:t xml:space="preserve">Fashion_dataset.csv </w:t>
       </w:r>
       <w:r>
+        <w:rPr>
+          <w:sz w:val="20"/>
+          <w:szCs w:val="20"/>
+        </w:rPr>
         <w:object w:dxaOrig="1541" w:dyaOrig="998" w14:anchorId="0C0BC410">
           <v:shapetype id="_x0000_t75" coordsize="21600,21600" o:spt="75" o:preferrelative="t" path="m@4@5l@4@11@9@11@9@5xe" filled="f" stroked="f">
             <v:stroke joinstyle="miter"/>
@@ -341,13 +518,13 @@
             <v:path o:extrusionok="f" gradientshapeok="t" o:connecttype="rect"/>
             <o:lock v:ext="edit" aspectratio="t"/>
           </v:shapetype>
-          <v:shape id="_x0000_i1025" type="#_x0000_t75" style="width:77.2pt;height:50.1pt" o:ole="">
+          <v:shape id="_x0000_i1025" type="#_x0000_t75" style="width:77.15pt;height:50.05pt" o:ole="">
             <v:imagedata r:id="rId7" o:title=""/>
           </v:shape>
           <o:OLEObject Type="Link" ProgID="Excel.SheetMacroEnabled.12" ShapeID="_x0000_i1025" DrawAspect="Icon" r:id="rId8" UpdateMode="Always">
             <o:LinkType>EnhancedMetaFile</o:LinkType>
             <o:LockedField>false</o:LockedField>
-            <o:FieldCodes>\f 0</o:FieldCodes>
+            <o:FieldCodes>\f 0 \* MERGEFORMAT</o:FieldCodes>
           </o:OLEObject>
         </w:object>
       </w:r>
@@ -355,6 +532,10 @@
     <w:p>
       <w:pPr>
         <w:pStyle w:val="NoSpacing"/>
+        <w:rPr>
+          <w:sz w:val="20"/>
+          <w:szCs w:val="20"/>
+        </w:rPr>
       </w:pPr>
     </w:p>
     <w:p>
@@ -363,6 +544,8 @@
         <w:rPr>
           <w:b/>
           <w:bCs/>
+          <w:sz w:val="20"/>
+          <w:szCs w:val="20"/>
           <w:u w:val="single"/>
         </w:rPr>
       </w:pPr>
@@ -370,6 +553,8 @@
         <w:rPr>
           <w:b/>
           <w:bCs/>
+          <w:sz w:val="20"/>
+          <w:szCs w:val="20"/>
           <w:u w:val="single"/>
         </w:rPr>
         <w:t>Tasks performed:</w:t>
@@ -382,14 +567,30 @@
           <w:ilvl w:val="0"/>
           <w:numId w:val="2"/>
         </w:numPr>
-      </w:pPr>
-      <w:r>
+        <w:rPr>
+          <w:sz w:val="20"/>
+          <w:szCs w:val="20"/>
+        </w:rPr>
+      </w:pPr>
+      <w:r>
+        <w:rPr>
+          <w:sz w:val="20"/>
+          <w:szCs w:val="20"/>
+        </w:rPr>
         <w:t>Importing the data</w:t>
       </w:r>
       <w:r>
+        <w:rPr>
+          <w:sz w:val="20"/>
+          <w:szCs w:val="20"/>
+        </w:rPr>
         <w:t xml:space="preserve"> (fashion_dataset.csv) </w:t>
       </w:r>
       <w:r>
+        <w:rPr>
+          <w:sz w:val="20"/>
+          <w:szCs w:val="20"/>
+        </w:rPr>
         <w:t>using “Import Flat File” on database</w:t>
       </w:r>
     </w:p>
@@ -400,8 +601,16 @@
           <w:ilvl w:val="1"/>
           <w:numId w:val="2"/>
         </w:numPr>
-      </w:pPr>
-      <w:r>
+        <w:rPr>
+          <w:sz w:val="20"/>
+          <w:szCs w:val="20"/>
+        </w:rPr>
+      </w:pPr>
+      <w:r>
+        <w:rPr>
+          <w:sz w:val="20"/>
+          <w:szCs w:val="20"/>
+        </w:rPr>
         <w:t xml:space="preserve">Importing data to SQL server </w:t>
       </w:r>
     </w:p>
@@ -412,8 +621,16 @@
           <w:ilvl w:val="1"/>
           <w:numId w:val="2"/>
         </w:numPr>
-      </w:pPr>
-      <w:r>
+        <w:rPr>
+          <w:sz w:val="20"/>
+          <w:szCs w:val="20"/>
+        </w:rPr>
+      </w:pPr>
+      <w:r>
+        <w:rPr>
+          <w:sz w:val="20"/>
+          <w:szCs w:val="20"/>
+        </w:rPr>
         <w:t xml:space="preserve">Importing data to Power BI Desktop </w:t>
       </w:r>
     </w:p>
@@ -421,6 +638,10 @@
       <w:pPr>
         <w:pStyle w:val="NoSpacing"/>
         <w:ind w:left="1440"/>
+        <w:rPr>
+          <w:sz w:val="20"/>
+          <w:szCs w:val="20"/>
+        </w:rPr>
       </w:pPr>
     </w:p>
     <w:p>
@@ -430,8 +651,16 @@
           <w:ilvl w:val="0"/>
           <w:numId w:val="2"/>
         </w:numPr>
-      </w:pPr>
-      <w:r>
+        <w:rPr>
+          <w:sz w:val="20"/>
+          <w:szCs w:val="20"/>
+        </w:rPr>
+      </w:pPr>
+      <w:r>
+        <w:rPr>
+          <w:sz w:val="20"/>
+          <w:szCs w:val="20"/>
+        </w:rPr>
         <w:t xml:space="preserve">Data Profiling &amp; Cleaning </w:t>
       </w:r>
     </w:p>
@@ -442,8 +671,16 @@
           <w:ilvl w:val="1"/>
           <w:numId w:val="2"/>
         </w:numPr>
-      </w:pPr>
-      <w:r>
+        <w:rPr>
+          <w:sz w:val="20"/>
+          <w:szCs w:val="20"/>
+        </w:rPr>
+      </w:pPr>
+      <w:r>
+        <w:rPr>
+          <w:sz w:val="20"/>
+          <w:szCs w:val="20"/>
+        </w:rPr>
         <w:t xml:space="preserve">Data Profiling and Data Types </w:t>
       </w:r>
     </w:p>
@@ -454,8 +691,16 @@
           <w:ilvl w:val="1"/>
           <w:numId w:val="2"/>
         </w:numPr>
-      </w:pPr>
-      <w:r>
+        <w:rPr>
+          <w:sz w:val="20"/>
+          <w:szCs w:val="20"/>
+        </w:rPr>
+      </w:pPr>
+      <w:r>
+        <w:rPr>
+          <w:sz w:val="20"/>
+          <w:szCs w:val="20"/>
+        </w:rPr>
         <w:t xml:space="preserve">Replacing null values </w:t>
       </w:r>
     </w:p>
@@ -466,9 +711,16 @@
           <w:ilvl w:val="1"/>
           <w:numId w:val="2"/>
         </w:numPr>
-      </w:pPr>
-      <w:r>
-        <w:lastRenderedPageBreak/>
+        <w:rPr>
+          <w:sz w:val="20"/>
+          <w:szCs w:val="20"/>
+        </w:rPr>
+      </w:pPr>
+      <w:r>
+        <w:rPr>
+          <w:sz w:val="20"/>
+          <w:szCs w:val="20"/>
+        </w:rPr>
         <w:t>Adding Rating Category column</w:t>
       </w:r>
     </w:p>
@@ -476,6 +728,10 @@
       <w:pPr>
         <w:pStyle w:val="NoSpacing"/>
         <w:ind w:left="1440"/>
+        <w:rPr>
+          <w:sz w:val="20"/>
+          <w:szCs w:val="20"/>
+        </w:rPr>
       </w:pPr>
     </w:p>
     <w:p>
@@ -485,8 +741,16 @@
           <w:ilvl w:val="0"/>
           <w:numId w:val="2"/>
         </w:numPr>
-      </w:pPr>
-      <w:r>
+        <w:rPr>
+          <w:sz w:val="20"/>
+          <w:szCs w:val="20"/>
+        </w:rPr>
+      </w:pPr>
+      <w:r>
+        <w:rPr>
+          <w:sz w:val="20"/>
+          <w:szCs w:val="20"/>
+        </w:rPr>
         <w:t xml:space="preserve">Data Transformation Steps </w:t>
       </w:r>
     </w:p>
@@ -497,8 +761,16 @@
           <w:ilvl w:val="1"/>
           <w:numId w:val="2"/>
         </w:numPr>
-      </w:pPr>
-      <w:r>
+        <w:rPr>
+          <w:sz w:val="20"/>
+          <w:szCs w:val="20"/>
+        </w:rPr>
+      </w:pPr>
+      <w:r>
+        <w:rPr>
+          <w:sz w:val="20"/>
+          <w:szCs w:val="20"/>
+        </w:rPr>
         <w:t xml:space="preserve">Data cleaning </w:t>
       </w:r>
     </w:p>
@@ -509,14 +781,26 @@
           <w:ilvl w:val="1"/>
           <w:numId w:val="2"/>
         </w:numPr>
-      </w:pPr>
-      <w:r>
+        <w:rPr>
+          <w:sz w:val="20"/>
+          <w:szCs w:val="20"/>
+        </w:rPr>
+      </w:pPr>
+      <w:r>
+        <w:rPr>
+          <w:sz w:val="20"/>
+          <w:szCs w:val="20"/>
+        </w:rPr>
         <w:t xml:space="preserve">Adding custom discount column </w:t>
       </w:r>
     </w:p>
     <w:p>
       <w:pPr>
         <w:pStyle w:val="NoSpacing"/>
+        <w:rPr>
+          <w:sz w:val="20"/>
+          <w:szCs w:val="20"/>
+        </w:rPr>
       </w:pPr>
     </w:p>
     <w:p>
@@ -526,8 +810,16 @@
           <w:ilvl w:val="0"/>
           <w:numId w:val="2"/>
         </w:numPr>
-      </w:pPr>
-      <w:r>
+        <w:rPr>
+          <w:sz w:val="20"/>
+          <w:szCs w:val="20"/>
+        </w:rPr>
+      </w:pPr>
+      <w:r>
+        <w:rPr>
+          <w:sz w:val="20"/>
+          <w:szCs w:val="20"/>
+        </w:rPr>
         <w:t>Sales Performance &amp; Revenue</w:t>
       </w:r>
     </w:p>
@@ -538,8 +830,16 @@
           <w:ilvl w:val="1"/>
           <w:numId w:val="2"/>
         </w:numPr>
-      </w:pPr>
-      <w:r>
+        <w:rPr>
+          <w:sz w:val="20"/>
+          <w:szCs w:val="20"/>
+        </w:rPr>
+      </w:pPr>
+      <w:r>
+        <w:rPr>
+          <w:sz w:val="20"/>
+          <w:szCs w:val="20"/>
+        </w:rPr>
         <w:t xml:space="preserve">Total sales KPI card </w:t>
       </w:r>
     </w:p>
@@ -550,8 +850,17 @@
           <w:ilvl w:val="1"/>
           <w:numId w:val="2"/>
         </w:numPr>
-      </w:pPr>
-      <w:r>
+        <w:rPr>
+          <w:sz w:val="20"/>
+          <w:szCs w:val="20"/>
+        </w:rPr>
+      </w:pPr>
+      <w:r>
+        <w:rPr>
+          <w:sz w:val="20"/>
+          <w:szCs w:val="20"/>
+        </w:rPr>
+        <w:lastRenderedPageBreak/>
         <w:t xml:space="preserve">Avg. Order Value &amp; Units Sold </w:t>
       </w:r>
     </w:p>
@@ -562,14 +871,26 @@
           <w:ilvl w:val="1"/>
           <w:numId w:val="2"/>
         </w:numPr>
-      </w:pPr>
-      <w:r>
+        <w:rPr>
+          <w:sz w:val="20"/>
+          <w:szCs w:val="20"/>
+        </w:rPr>
+      </w:pPr>
+      <w:r>
+        <w:rPr>
+          <w:sz w:val="20"/>
+          <w:szCs w:val="20"/>
+        </w:rPr>
         <w:t>Revenue by Brand</w:t>
       </w:r>
     </w:p>
     <w:p>
       <w:pPr>
         <w:pStyle w:val="NoSpacing"/>
+        <w:rPr>
+          <w:sz w:val="20"/>
+          <w:szCs w:val="20"/>
+        </w:rPr>
       </w:pPr>
     </w:p>
     <w:p>
@@ -579,8 +900,16 @@
           <w:ilvl w:val="0"/>
           <w:numId w:val="2"/>
         </w:numPr>
-      </w:pPr>
-      <w:r>
+        <w:rPr>
+          <w:sz w:val="20"/>
+          <w:szCs w:val="20"/>
+        </w:rPr>
+      </w:pPr>
+      <w:r>
+        <w:rPr>
+          <w:sz w:val="20"/>
+          <w:szCs w:val="20"/>
+        </w:rPr>
         <w:t xml:space="preserve">Customer Behavior &amp; Returns </w:t>
       </w:r>
     </w:p>
@@ -591,8 +920,16 @@
           <w:ilvl w:val="1"/>
           <w:numId w:val="2"/>
         </w:numPr>
-      </w:pPr>
-      <w:r>
+        <w:rPr>
+          <w:sz w:val="20"/>
+          <w:szCs w:val="20"/>
+        </w:rPr>
+      </w:pPr>
+      <w:r>
+        <w:rPr>
+          <w:sz w:val="20"/>
+          <w:szCs w:val="20"/>
+        </w:rPr>
         <w:t xml:space="preserve">Creating report page </w:t>
       </w:r>
     </w:p>
@@ -603,8 +940,16 @@
           <w:ilvl w:val="1"/>
           <w:numId w:val="2"/>
         </w:numPr>
-      </w:pPr>
-      <w:r>
+        <w:rPr>
+          <w:sz w:val="20"/>
+          <w:szCs w:val="20"/>
+        </w:rPr>
+      </w:pPr>
+      <w:r>
+        <w:rPr>
+          <w:sz w:val="20"/>
+          <w:szCs w:val="20"/>
+        </w:rPr>
         <w:t xml:space="preserve">Return by Return Reasons </w:t>
       </w:r>
     </w:p>
@@ -615,8 +960,16 @@
           <w:ilvl w:val="1"/>
           <w:numId w:val="2"/>
         </w:numPr>
-      </w:pPr>
-      <w:r>
+        <w:rPr>
+          <w:sz w:val="20"/>
+          <w:szCs w:val="20"/>
+        </w:rPr>
+      </w:pPr>
+      <w:r>
+        <w:rPr>
+          <w:sz w:val="20"/>
+          <w:szCs w:val="20"/>
+        </w:rPr>
         <w:t xml:space="preserve">Number of reasons by season </w:t>
       </w:r>
     </w:p>
@@ -627,8 +980,16 @@
           <w:ilvl w:val="1"/>
           <w:numId w:val="2"/>
         </w:numPr>
-      </w:pPr>
-      <w:r>
+        <w:rPr>
+          <w:sz w:val="20"/>
+          <w:szCs w:val="20"/>
+        </w:rPr>
+      </w:pPr>
+      <w:r>
+        <w:rPr>
+          <w:sz w:val="20"/>
+          <w:szCs w:val="20"/>
+        </w:rPr>
         <w:t xml:space="preserve">Return Category </w:t>
       </w:r>
     </w:p>
@@ -639,14 +1000,26 @@
           <w:ilvl w:val="1"/>
           <w:numId w:val="2"/>
         </w:numPr>
-      </w:pPr>
-      <w:r>
+        <w:rPr>
+          <w:sz w:val="20"/>
+          <w:szCs w:val="20"/>
+        </w:rPr>
+      </w:pPr>
+      <w:r>
+        <w:rPr>
+          <w:sz w:val="20"/>
+          <w:szCs w:val="20"/>
+        </w:rPr>
         <w:t>Returns by Rating Category</w:t>
       </w:r>
     </w:p>
     <w:p>
       <w:pPr>
         <w:pStyle w:val="NoSpacing"/>
+        <w:rPr>
+          <w:sz w:val="20"/>
+          <w:szCs w:val="20"/>
+        </w:rPr>
       </w:pPr>
     </w:p>
     <w:p>
@@ -656,8 +1029,16 @@
           <w:ilvl w:val="0"/>
           <w:numId w:val="2"/>
         </w:numPr>
-      </w:pPr>
-      <w:r>
+        <w:rPr>
+          <w:sz w:val="20"/>
+          <w:szCs w:val="20"/>
+        </w:rPr>
+      </w:pPr>
+      <w:r>
+        <w:rPr>
+          <w:sz w:val="20"/>
+          <w:szCs w:val="20"/>
+        </w:rPr>
         <w:t xml:space="preserve">Inventory &amp; Category </w:t>
       </w:r>
     </w:p>
@@ -668,8 +1049,16 @@
           <w:ilvl w:val="1"/>
           <w:numId w:val="2"/>
         </w:numPr>
-      </w:pPr>
-      <w:r>
+        <w:rPr>
+          <w:sz w:val="20"/>
+          <w:szCs w:val="20"/>
+        </w:rPr>
+      </w:pPr>
+      <w:r>
+        <w:rPr>
+          <w:sz w:val="20"/>
+          <w:szCs w:val="20"/>
+        </w:rPr>
         <w:t>Creating a Report page – Inventory &amp; Category Performance</w:t>
       </w:r>
     </w:p>
@@ -680,8 +1069,16 @@
           <w:ilvl w:val="1"/>
           <w:numId w:val="2"/>
         </w:numPr>
-      </w:pPr>
-      <w:r>
+        <w:rPr>
+          <w:sz w:val="20"/>
+          <w:szCs w:val="20"/>
+        </w:rPr>
+      </w:pPr>
+      <w:r>
+        <w:rPr>
+          <w:sz w:val="20"/>
+          <w:szCs w:val="20"/>
+        </w:rPr>
         <w:t xml:space="preserve">Stock Quantity by Brand &amp; Category </w:t>
       </w:r>
     </w:p>
@@ -692,8 +1089,16 @@
           <w:ilvl w:val="1"/>
           <w:numId w:val="2"/>
         </w:numPr>
-      </w:pPr>
-      <w:r>
+        <w:rPr>
+          <w:sz w:val="20"/>
+          <w:szCs w:val="20"/>
+        </w:rPr>
+      </w:pPr>
+      <w:r>
+        <w:rPr>
+          <w:sz w:val="20"/>
+          <w:szCs w:val="20"/>
+        </w:rPr>
         <w:t xml:space="preserve">Units Sold by Month </w:t>
       </w:r>
     </w:p>
@@ -704,8 +1109,16 @@
           <w:ilvl w:val="1"/>
           <w:numId w:val="2"/>
         </w:numPr>
-      </w:pPr>
-      <w:r>
+        <w:rPr>
+          <w:sz w:val="20"/>
+          <w:szCs w:val="20"/>
+        </w:rPr>
+      </w:pPr>
+      <w:r>
+        <w:rPr>
+          <w:sz w:val="20"/>
+          <w:szCs w:val="20"/>
+        </w:rPr>
         <w:t xml:space="preserve">Avg. Order Value by Category </w:t>
       </w:r>
     </w:p>
@@ -716,14 +1129,26 @@
           <w:ilvl w:val="1"/>
           <w:numId w:val="2"/>
         </w:numPr>
-      </w:pPr>
-      <w:r>
+        <w:rPr>
+          <w:sz w:val="20"/>
+          <w:szCs w:val="20"/>
+        </w:rPr>
+      </w:pPr>
+      <w:r>
+        <w:rPr>
+          <w:sz w:val="20"/>
+          <w:szCs w:val="20"/>
+        </w:rPr>
         <w:t xml:space="preserve">Avg. Order Value by Brand </w:t>
       </w:r>
     </w:p>
     <w:p>
       <w:pPr>
         <w:pStyle w:val="NoSpacing"/>
+        <w:rPr>
+          <w:sz w:val="20"/>
+          <w:szCs w:val="20"/>
+        </w:rPr>
       </w:pPr>
     </w:p>
     <w:p>
@@ -733,26 +1158,54 @@
           <w:ilvl w:val="0"/>
           <w:numId w:val="2"/>
         </w:numPr>
-      </w:pPr>
-      <w:r>
+        <w:rPr>
+          <w:sz w:val="20"/>
+          <w:szCs w:val="20"/>
+        </w:rPr>
+      </w:pPr>
+      <w:r>
+        <w:rPr>
+          <w:sz w:val="20"/>
+          <w:szCs w:val="20"/>
+        </w:rPr>
         <w:t xml:space="preserve">Refresh the </w:t>
       </w:r>
       <w:r>
+        <w:rPr>
+          <w:sz w:val="20"/>
+          <w:szCs w:val="20"/>
+        </w:rPr>
         <w:t xml:space="preserve">Power BI </w:t>
       </w:r>
       <w:r>
+        <w:rPr>
+          <w:sz w:val="20"/>
+          <w:szCs w:val="20"/>
+        </w:rPr>
         <w:t>report</w:t>
       </w:r>
       <w:r>
+        <w:rPr>
+          <w:sz w:val="20"/>
+          <w:szCs w:val="20"/>
+        </w:rPr>
         <w:t>/dashboard</w:t>
       </w:r>
       <w:r>
+        <w:rPr>
+          <w:sz w:val="20"/>
+          <w:szCs w:val="20"/>
+        </w:rPr>
         <w:t xml:space="preserve"> after UPDATE statement from brand = ‘Zara’ to ‘H&amp;M’</w:t>
       </w:r>
     </w:p>
     <w:p>
       <w:pPr>
         <w:pStyle w:val="NoSpacing"/>
+        <w:rPr>
+          <w:sz w:val="20"/>
+          <w:szCs w:val="20"/>
+        </w:rPr>
       </w:pPr>
     </w:p>
     <w:p>
@@ -761,6 +1214,8 @@
         <w:rPr>
           <w:b/>
           <w:bCs/>
+          <w:sz w:val="20"/>
+          <w:szCs w:val="20"/>
           <w:u w:val="single"/>
         </w:rPr>
       </w:pPr>
@@ -768,6 +1223,8 @@
         <w:rPr>
           <w:b/>
           <w:bCs/>
+          <w:sz w:val="20"/>
+          <w:szCs w:val="20"/>
           <w:u w:val="single"/>
         </w:rPr>
         <w:t xml:space="preserve">Queries: </w:t>
@@ -780,21 +1237,43 @@
           <w:ilvl w:val="0"/>
           <w:numId w:val="8"/>
         </w:numPr>
-      </w:pPr>
-      <w:r>
+        <w:rPr>
+          <w:sz w:val="20"/>
+          <w:szCs w:val="20"/>
+        </w:rPr>
+      </w:pPr>
+      <w:r>
+        <w:rPr>
+          <w:sz w:val="20"/>
+          <w:szCs w:val="20"/>
+        </w:rPr>
         <w:t xml:space="preserve">CREATE </w:t>
       </w:r>
+      <w:r>
+        <w:rPr>
+          <w:sz w:val="20"/>
+          <w:szCs w:val="20"/>
+        </w:rPr>
+        <w:t xml:space="preserve">DATABASE </w:t>
+      </w:r>
+      <w:proofErr w:type="spellStart"/>
       <w:proofErr w:type="gramStart"/>
       <w:r>
-        <w:t xml:space="preserve">DATABASE </w:t>
-      </w:r>
-      <w:r>
-        <w:t xml:space="preserve"> PowerBI</w:t>
+        <w:rPr>
+          <w:sz w:val="20"/>
+          <w:szCs w:val="20"/>
+        </w:rPr>
+        <w:t>PowerBI</w:t>
+      </w:r>
+      <w:proofErr w:type="spellEnd"/>
+      <w:r>
+        <w:rPr>
+          <w:sz w:val="20"/>
+          <w:szCs w:val="20"/>
+        </w:rPr>
+        <w:t>;</w:t>
       </w:r>
       <w:proofErr w:type="gramEnd"/>
-      <w:r>
-        <w:t>;</w:t>
-      </w:r>
     </w:p>
     <w:p>
       <w:pPr>
@@ -803,13 +1282,34 @@
           <w:ilvl w:val="0"/>
           <w:numId w:val="8"/>
         </w:numPr>
-      </w:pPr>
-      <w:r>
+        <w:rPr>
+          <w:sz w:val="20"/>
+          <w:szCs w:val="20"/>
+        </w:rPr>
+      </w:pPr>
+      <w:r>
+        <w:rPr>
+          <w:sz w:val="20"/>
+          <w:szCs w:val="20"/>
+        </w:rPr>
         <w:t xml:space="preserve">USE </w:t>
       </w:r>
+      <w:proofErr w:type="spellStart"/>
       <w:proofErr w:type="gramStart"/>
       <w:r>
-        <w:t>PowerBI;</w:t>
+        <w:rPr>
+          <w:sz w:val="20"/>
+          <w:szCs w:val="20"/>
+        </w:rPr>
+        <w:t>PowerBI</w:t>
+      </w:r>
+      <w:proofErr w:type="spellEnd"/>
+      <w:r>
+        <w:rPr>
+          <w:sz w:val="20"/>
+          <w:szCs w:val="20"/>
+        </w:rPr>
+        <w:t>;</w:t>
       </w:r>
       <w:proofErr w:type="gramEnd"/>
     </w:p>
@@ -820,16 +1320,48 @@
           <w:ilvl w:val="0"/>
           <w:numId w:val="8"/>
         </w:numPr>
-      </w:pPr>
-      <w:r>
-        <w:t>SELECT * FROM f</w:t>
-      </w:r>
-      <w:r>
+        <w:rPr>
+          <w:sz w:val="20"/>
+          <w:szCs w:val="20"/>
+        </w:rPr>
+      </w:pPr>
+      <w:r>
+        <w:rPr>
+          <w:sz w:val="20"/>
+          <w:szCs w:val="20"/>
+        </w:rPr>
+        <w:t xml:space="preserve">SELECT * FROM </w:t>
+      </w:r>
+      <w:proofErr w:type="spellStart"/>
+      <w:r>
+        <w:rPr>
+          <w:sz w:val="20"/>
+          <w:szCs w:val="20"/>
+        </w:rPr>
+        <w:t>f</w:t>
+      </w:r>
+      <w:r>
+        <w:rPr>
+          <w:sz w:val="20"/>
+          <w:szCs w:val="20"/>
+        </w:rPr>
         <w:t>ashion_</w:t>
       </w:r>
       <w:proofErr w:type="gramStart"/>
       <w:r>
-        <w:t>dataset;</w:t>
+        <w:rPr>
+          <w:sz w:val="20"/>
+          <w:szCs w:val="20"/>
+        </w:rPr>
+        <w:t>dataset</w:t>
+      </w:r>
+      <w:proofErr w:type="spellEnd"/>
+      <w:r>
+        <w:rPr>
+          <w:sz w:val="20"/>
+          <w:szCs w:val="20"/>
+        </w:rPr>
+        <w:t>;</w:t>
       </w:r>
       <w:proofErr w:type="gramEnd"/>
     </w:p>
@@ -840,55 +1372,141 @@
           <w:ilvl w:val="0"/>
           <w:numId w:val="8"/>
         </w:numPr>
-      </w:pPr>
-      <w:r>
+        <w:rPr>
+          <w:sz w:val="20"/>
+          <w:szCs w:val="20"/>
+        </w:rPr>
+      </w:pPr>
+      <w:r>
+        <w:rPr>
+          <w:sz w:val="20"/>
+          <w:szCs w:val="20"/>
+        </w:rPr>
         <w:t xml:space="preserve"> </w:t>
       </w:r>
       <w:r>
-        <w:t>UPDATE [dbo</w:t>
+        <w:rPr>
+          <w:sz w:val="20"/>
+          <w:szCs w:val="20"/>
+        </w:rPr>
+        <w:t>UPDATE [</w:t>
+      </w:r>
+      <w:proofErr w:type="spellStart"/>
+      <w:r>
+        <w:rPr>
+          <w:sz w:val="20"/>
+          <w:szCs w:val="20"/>
+        </w:rPr>
+        <w:t>dbo</w:t>
+      </w:r>
+      <w:proofErr w:type="spellEnd"/>
+      <w:r>
+        <w:rPr>
+          <w:sz w:val="20"/>
+          <w:szCs w:val="20"/>
+        </w:rPr>
+        <w:t>]. [</w:t>
+      </w:r>
+      <w:proofErr w:type="spellStart"/>
+      <w:r>
+        <w:rPr>
+          <w:sz w:val="20"/>
+          <w:szCs w:val="20"/>
+        </w:rPr>
+        <w:t>fashion_</w:t>
       </w:r>
       <w:proofErr w:type="gramStart"/>
       <w:r>
-        <w:t>].[</w:t>
+        <w:rPr>
+          <w:sz w:val="20"/>
+          <w:szCs w:val="20"/>
+        </w:rPr>
+        <w:t>dataset</w:t>
+      </w:r>
+      <w:proofErr w:type="spellEnd"/>
+      <w:r>
+        <w:rPr>
+          <w:sz w:val="20"/>
+          <w:szCs w:val="20"/>
+        </w:rPr>
+        <w:t>]</w:t>
+      </w:r>
+      <w:r>
+        <w:rPr>
+          <w:sz w:val="20"/>
+          <w:szCs w:val="20"/>
+        </w:rPr>
+        <w:t xml:space="preserve">  </w:t>
+      </w:r>
+      <w:r>
+        <w:rPr>
+          <w:sz w:val="20"/>
+          <w:szCs w:val="20"/>
+        </w:rPr>
+        <w:t xml:space="preserve"> </w:t>
       </w:r>
       <w:proofErr w:type="gramEnd"/>
       <w:r>
-        <w:t>fashion_</w:t>
+        <w:rPr>
+          <w:sz w:val="20"/>
+          <w:szCs w:val="20"/>
+        </w:rPr>
+        <w:t xml:space="preserve">   </w:t>
+      </w:r>
+      <w:r>
+        <w:rPr>
+          <w:sz w:val="20"/>
+          <w:szCs w:val="20"/>
+        </w:rPr>
+        <w:t xml:space="preserve">-- to update the table </w:t>
+      </w:r>
+    </w:p>
+    <w:p>
+      <w:pPr>
+        <w:pStyle w:val="NoSpacing"/>
+        <w:ind w:left="720"/>
+        <w:rPr>
+          <w:sz w:val="20"/>
+          <w:szCs w:val="20"/>
+        </w:rPr>
+      </w:pPr>
+      <w:r>
+        <w:rPr>
+          <w:sz w:val="20"/>
+          <w:szCs w:val="20"/>
+        </w:rPr>
+        <w:t>SET brand='H&amp;M'</w:t>
+      </w:r>
+    </w:p>
+    <w:p>
+      <w:pPr>
+        <w:pStyle w:val="NoSpacing"/>
+        <w:ind w:left="720"/>
+        <w:rPr>
+          <w:sz w:val="20"/>
+          <w:szCs w:val="20"/>
+        </w:rPr>
+      </w:pPr>
+      <w:r>
+        <w:rPr>
+          <w:sz w:val="20"/>
+          <w:szCs w:val="20"/>
+        </w:rPr>
+        <w:t>WHERE brand='Zara</w:t>
       </w:r>
       <w:proofErr w:type="gramStart"/>
       <w:r>
-        <w:t>dataset]</w:t>
-      </w:r>
-      <w:r>
-        <w:t xml:space="preserve">  --</w:t>
-      </w:r>
-      <w:proofErr w:type="gramEnd"/>
-      <w:r>
-        <w:t xml:space="preserve"> to update the table </w:t>
-      </w:r>
-    </w:p>
-    <w:p>
-      <w:pPr>
-        <w:pStyle w:val="NoSpacing"/>
-        <w:ind w:left="720"/>
-      </w:pPr>
-      <w:r>
-        <w:t>SET brand='H&amp;M'</w:t>
-      </w:r>
-    </w:p>
-    <w:p>
-      <w:pPr>
-        <w:pStyle w:val="NoSpacing"/>
-        <w:ind w:left="720"/>
-      </w:pPr>
-      <w:r>
-        <w:t>WHERE brand='Zara</w:t>
-      </w:r>
-      <w:proofErr w:type="gramStart"/>
-      <w:r>
+        <w:rPr>
+          <w:sz w:val="20"/>
+          <w:szCs w:val="20"/>
+        </w:rPr>
         <w:t>'</w:t>
       </w:r>
       <w:r>
+        <w:rPr>
+          <w:sz w:val="20"/>
+          <w:szCs w:val="20"/>
+        </w:rPr>
         <w:t>;</w:t>
       </w:r>
       <w:proofErr w:type="gramEnd"/>
@@ -898,6 +1516,8 @@
         <w:rPr>
           <w:b/>
           <w:bCs/>
+          <w:sz w:val="20"/>
+          <w:szCs w:val="20"/>
           <w:u w:val="single"/>
         </w:rPr>
       </w:pPr>
@@ -905,6 +1525,8 @@
         <w:rPr>
           <w:b/>
           <w:bCs/>
+          <w:sz w:val="20"/>
+          <w:szCs w:val="20"/>
           <w:u w:val="single"/>
         </w:rPr>
         <w:t>Custom Measures:</w:t>
@@ -917,39 +1539,174 @@
           <w:ilvl w:val="0"/>
           <w:numId w:val="5"/>
         </w:numPr>
-      </w:pPr>
-      <w:r>
+        <w:rPr>
+          <w:sz w:val="20"/>
+          <w:szCs w:val="20"/>
+        </w:rPr>
+      </w:pPr>
+      <w:r>
+        <w:rPr>
+          <w:sz w:val="20"/>
+          <w:szCs w:val="20"/>
+        </w:rPr>
         <w:t>% Return</w:t>
       </w:r>
     </w:p>
     <w:p>
-      <w:r>
-        <w:t xml:space="preserve">Formula: </w:t>
-      </w:r>
-      <w:r>
-        <w:t>% Return = (countx(filter(fashion_</w:t>
+      <w:pPr>
+        <w:rPr>
+          <w:sz w:val="20"/>
+          <w:szCs w:val="20"/>
+        </w:rPr>
+      </w:pPr>
+      <w:r>
+        <w:rPr>
+          <w:sz w:val="20"/>
+          <w:szCs w:val="20"/>
+        </w:rPr>
+        <w:t>Formula: % Return = (</w:t>
+      </w:r>
+      <w:proofErr w:type="spellStart"/>
+      <w:r>
+        <w:rPr>
+          <w:sz w:val="20"/>
+          <w:szCs w:val="20"/>
+        </w:rPr>
+        <w:t>countx</w:t>
+      </w:r>
+      <w:proofErr w:type="spellEnd"/>
+      <w:r>
+        <w:rPr>
+          <w:sz w:val="20"/>
+          <w:szCs w:val="20"/>
+        </w:rPr>
+        <w:t>(filter(</w:t>
+      </w:r>
+      <w:proofErr w:type="spellStart"/>
+      <w:r>
+        <w:rPr>
+          <w:sz w:val="20"/>
+          <w:szCs w:val="20"/>
+        </w:rPr>
+        <w:t>fashion_</w:t>
       </w:r>
       <w:proofErr w:type="gramStart"/>
       <w:r>
+        <w:rPr>
+          <w:sz w:val="20"/>
+          <w:szCs w:val="20"/>
+        </w:rPr>
         <w:t>dataset,fashion</w:t>
       </w:r>
       <w:proofErr w:type="gramEnd"/>
       <w:r>
-        <w:t>_dataset[is_returned] = TRUE()</w:t>
+        <w:rPr>
+          <w:sz w:val="20"/>
+          <w:szCs w:val="20"/>
+        </w:rPr>
+        <w:t>_dataset</w:t>
+      </w:r>
+      <w:proofErr w:type="spellEnd"/>
+      <w:r>
+        <w:rPr>
+          <w:sz w:val="20"/>
+          <w:szCs w:val="20"/>
+        </w:rPr>
+        <w:t>[</w:t>
+      </w:r>
+      <w:proofErr w:type="spellStart"/>
+      <w:r>
+        <w:rPr>
+          <w:sz w:val="20"/>
+          <w:szCs w:val="20"/>
+        </w:rPr>
+        <w:t>is_returned</w:t>
+      </w:r>
+      <w:proofErr w:type="spellEnd"/>
+      <w:r>
+        <w:rPr>
+          <w:sz w:val="20"/>
+          <w:szCs w:val="20"/>
+        </w:rPr>
+        <w:t>] = TRUE()</w:t>
       </w:r>
       <w:proofErr w:type="gramStart"/>
       <w:r>
-        <w:t>),fashion</w:t>
+        <w:rPr>
+          <w:sz w:val="20"/>
+          <w:szCs w:val="20"/>
+        </w:rPr>
+        <w:t>),</w:t>
+      </w:r>
+      <w:proofErr w:type="spellStart"/>
+      <w:r>
+        <w:rPr>
+          <w:sz w:val="20"/>
+          <w:szCs w:val="20"/>
+        </w:rPr>
+        <w:t>fashion</w:t>
       </w:r>
       <w:proofErr w:type="gramEnd"/>
       <w:r>
-        <w:t>_dataset[product_id]) / COUNTROWS</w:t>
-      </w:r>
-      <w:r>
+        <w:rPr>
+          <w:sz w:val="20"/>
+          <w:szCs w:val="20"/>
+        </w:rPr>
+        <w:t>_dataset</w:t>
+      </w:r>
+      <w:proofErr w:type="spellEnd"/>
+      <w:r>
+        <w:rPr>
+          <w:sz w:val="20"/>
+          <w:szCs w:val="20"/>
+        </w:rPr>
+        <w:t>[</w:t>
+      </w:r>
+      <w:proofErr w:type="spellStart"/>
+      <w:r>
+        <w:rPr>
+          <w:sz w:val="20"/>
+          <w:szCs w:val="20"/>
+        </w:rPr>
+        <w:t>product_id</w:t>
+      </w:r>
+      <w:proofErr w:type="spellEnd"/>
+      <w:r>
+        <w:rPr>
+          <w:sz w:val="20"/>
+          <w:szCs w:val="20"/>
+        </w:rPr>
+        <w:t>]) / COUNTROWS</w:t>
+      </w:r>
+      <w:r>
+        <w:rPr>
+          <w:sz w:val="20"/>
+          <w:szCs w:val="20"/>
+        </w:rPr>
         <w:t xml:space="preserve"> </w:t>
       </w:r>
       <w:r>
-        <w:t>(fashion_dataset)) * 100</w:t>
+        <w:rPr>
+          <w:sz w:val="20"/>
+          <w:szCs w:val="20"/>
+        </w:rPr>
+        <w:t>(</w:t>
+      </w:r>
+      <w:proofErr w:type="spellStart"/>
+      <w:r>
+        <w:rPr>
+          <w:sz w:val="20"/>
+          <w:szCs w:val="20"/>
+        </w:rPr>
+        <w:t>fashion_dataset</w:t>
+      </w:r>
+      <w:proofErr w:type="spellEnd"/>
+      <w:r>
+        <w:rPr>
+          <w:sz w:val="20"/>
+          <w:szCs w:val="20"/>
+        </w:rPr>
+        <w:t>)) * 100</w:t>
       </w:r>
     </w:p>
     <w:p>
@@ -959,29 +1716,124 @@
           <w:ilvl w:val="0"/>
           <w:numId w:val="5"/>
         </w:numPr>
-      </w:pPr>
-      <w:r>
+        <w:rPr>
+          <w:sz w:val="20"/>
+          <w:szCs w:val="20"/>
+        </w:rPr>
+      </w:pPr>
+      <w:r>
+        <w:rPr>
+          <w:sz w:val="20"/>
+          <w:szCs w:val="20"/>
+        </w:rPr>
         <w:t>Avg. Order Value</w:t>
       </w:r>
     </w:p>
     <w:p>
-      <w:r>
-        <w:t xml:space="preserve">Formula: </w:t>
-      </w:r>
-      <w:r>
-        <w:t>Avg. Order Value = SUM</w:t>
-      </w:r>
-      <w:r>
+      <w:pPr>
+        <w:rPr>
+          <w:sz w:val="20"/>
+          <w:szCs w:val="20"/>
+        </w:rPr>
+      </w:pPr>
+      <w:r>
+        <w:rPr>
+          <w:sz w:val="20"/>
+          <w:szCs w:val="20"/>
+        </w:rPr>
+        <w:t>Formula: Avg. Order Value = SUM</w:t>
+      </w:r>
+      <w:r>
+        <w:rPr>
+          <w:sz w:val="20"/>
+          <w:szCs w:val="20"/>
+        </w:rPr>
         <w:t xml:space="preserve"> </w:t>
       </w:r>
       <w:r>
-        <w:t>(fashion_dataset[current_price]) / COUNT</w:t>
-      </w:r>
-      <w:r>
+        <w:rPr>
+          <w:sz w:val="20"/>
+          <w:szCs w:val="20"/>
+        </w:rPr>
+        <w:t>(</w:t>
+      </w:r>
+      <w:proofErr w:type="spellStart"/>
+      <w:r>
+        <w:rPr>
+          <w:sz w:val="20"/>
+          <w:szCs w:val="20"/>
+        </w:rPr>
+        <w:t>fashion_dataset</w:t>
+      </w:r>
+      <w:proofErr w:type="spellEnd"/>
+      <w:r>
+        <w:rPr>
+          <w:sz w:val="20"/>
+          <w:szCs w:val="20"/>
+        </w:rPr>
+        <w:t>[</w:t>
+      </w:r>
+      <w:proofErr w:type="spellStart"/>
+      <w:r>
+        <w:rPr>
+          <w:sz w:val="20"/>
+          <w:szCs w:val="20"/>
+        </w:rPr>
+        <w:t>current_price</w:t>
+      </w:r>
+      <w:proofErr w:type="spellEnd"/>
+      <w:r>
+        <w:rPr>
+          <w:sz w:val="20"/>
+          <w:szCs w:val="20"/>
+        </w:rPr>
+        <w:t>]) / COUNT</w:t>
+      </w:r>
+      <w:r>
+        <w:rPr>
+          <w:sz w:val="20"/>
+          <w:szCs w:val="20"/>
+        </w:rPr>
         <w:t xml:space="preserve"> </w:t>
       </w:r>
       <w:r>
-        <w:t>(fashion_dataset[product_id])</w:t>
+        <w:rPr>
+          <w:sz w:val="20"/>
+          <w:szCs w:val="20"/>
+        </w:rPr>
+        <w:t>(</w:t>
+      </w:r>
+      <w:proofErr w:type="spellStart"/>
+      <w:r>
+        <w:rPr>
+          <w:sz w:val="20"/>
+          <w:szCs w:val="20"/>
+        </w:rPr>
+        <w:t>fashion_dataset</w:t>
+      </w:r>
+      <w:proofErr w:type="spellEnd"/>
+      <w:r>
+        <w:rPr>
+          <w:sz w:val="20"/>
+          <w:szCs w:val="20"/>
+        </w:rPr>
+        <w:t>[</w:t>
+      </w:r>
+      <w:proofErr w:type="spellStart"/>
+      <w:r>
+        <w:rPr>
+          <w:sz w:val="20"/>
+          <w:szCs w:val="20"/>
+        </w:rPr>
+        <w:t>product_id</w:t>
+      </w:r>
+      <w:proofErr w:type="spellEnd"/>
+      <w:r>
+        <w:rPr>
+          <w:sz w:val="20"/>
+          <w:szCs w:val="20"/>
+        </w:rPr>
+        <w:t>])</w:t>
       </w:r>
     </w:p>
     <w:p>
@@ -989,6 +1841,8 @@
         <w:rPr>
           <w:b/>
           <w:bCs/>
+          <w:sz w:val="20"/>
+          <w:szCs w:val="20"/>
           <w:u w:val="single"/>
         </w:rPr>
       </w:pPr>
@@ -996,9 +1850,10 @@
         <w:rPr>
           <w:b/>
           <w:bCs/>
+          <w:sz w:val="20"/>
+          <w:szCs w:val="20"/>
           <w:u w:val="single"/>
         </w:rPr>
-        <w:lastRenderedPageBreak/>
         <w:t>Visuals used:</w:t>
       </w:r>
     </w:p>
@@ -1009,8 +1864,16 @@
           <w:ilvl w:val="0"/>
           <w:numId w:val="6"/>
         </w:numPr>
-      </w:pPr>
-      <w:r>
+        <w:rPr>
+          <w:sz w:val="20"/>
+          <w:szCs w:val="20"/>
+        </w:rPr>
+      </w:pPr>
+      <w:r>
+        <w:rPr>
+          <w:sz w:val="20"/>
+          <w:szCs w:val="20"/>
+        </w:rPr>
         <w:t xml:space="preserve">Stacked bar chart </w:t>
       </w:r>
     </w:p>
@@ -1021,8 +1884,16 @@
           <w:ilvl w:val="0"/>
           <w:numId w:val="6"/>
         </w:numPr>
-      </w:pPr>
-      <w:r>
+        <w:rPr>
+          <w:sz w:val="20"/>
+          <w:szCs w:val="20"/>
+        </w:rPr>
+      </w:pPr>
+      <w:r>
+        <w:rPr>
+          <w:sz w:val="20"/>
+          <w:szCs w:val="20"/>
+        </w:rPr>
         <w:t xml:space="preserve">Clustered column chart </w:t>
       </w:r>
     </w:p>
@@ -1033,8 +1904,16 @@
           <w:ilvl w:val="0"/>
           <w:numId w:val="6"/>
         </w:numPr>
-      </w:pPr>
-      <w:r>
+        <w:rPr>
+          <w:sz w:val="20"/>
+          <w:szCs w:val="20"/>
+        </w:rPr>
+      </w:pPr>
+      <w:r>
+        <w:rPr>
+          <w:sz w:val="20"/>
+          <w:szCs w:val="20"/>
+        </w:rPr>
         <w:t xml:space="preserve">Line chart </w:t>
       </w:r>
     </w:p>
@@ -1045,8 +1924,16 @@
           <w:ilvl w:val="0"/>
           <w:numId w:val="6"/>
         </w:numPr>
-      </w:pPr>
-      <w:r>
+        <w:rPr>
+          <w:sz w:val="20"/>
+          <w:szCs w:val="20"/>
+        </w:rPr>
+      </w:pPr>
+      <w:r>
+        <w:rPr>
+          <w:sz w:val="20"/>
+          <w:szCs w:val="20"/>
+        </w:rPr>
         <w:t>Pie chart</w:t>
       </w:r>
     </w:p>
@@ -1057,8 +1944,16 @@
           <w:ilvl w:val="0"/>
           <w:numId w:val="6"/>
         </w:numPr>
-      </w:pPr>
-      <w:r>
+        <w:rPr>
+          <w:sz w:val="20"/>
+          <w:szCs w:val="20"/>
+        </w:rPr>
+      </w:pPr>
+      <w:r>
+        <w:rPr>
+          <w:sz w:val="20"/>
+          <w:szCs w:val="20"/>
+        </w:rPr>
         <w:t>Ribbon chart</w:t>
       </w:r>
     </w:p>
@@ -1069,8 +1964,16 @@
           <w:ilvl w:val="0"/>
           <w:numId w:val="6"/>
         </w:numPr>
-      </w:pPr>
-      <w:r>
+        <w:rPr>
+          <w:sz w:val="20"/>
+          <w:szCs w:val="20"/>
+        </w:rPr>
+      </w:pPr>
+      <w:r>
+        <w:rPr>
+          <w:sz w:val="20"/>
+          <w:szCs w:val="20"/>
+        </w:rPr>
         <w:t>Card(s)</w:t>
       </w:r>
     </w:p>
@@ -1081,8 +1984,16 @@
           <w:ilvl w:val="0"/>
           <w:numId w:val="6"/>
         </w:numPr>
-      </w:pPr>
-      <w:r>
+        <w:rPr>
+          <w:sz w:val="20"/>
+          <w:szCs w:val="20"/>
+        </w:rPr>
+      </w:pPr>
+      <w:r>
+        <w:rPr>
+          <w:sz w:val="20"/>
+          <w:szCs w:val="20"/>
+        </w:rPr>
         <w:t>Slicer</w:t>
       </w:r>
     </w:p>
@@ -1091,6 +2002,8 @@
         <w:rPr>
           <w:b/>
           <w:bCs/>
+          <w:sz w:val="20"/>
+          <w:szCs w:val="20"/>
           <w:u w:val="single"/>
         </w:rPr>
       </w:pPr>
@@ -1098,92 +2011,143 @@
         <w:rPr>
           <w:b/>
           <w:bCs/>
+          <w:sz w:val="20"/>
+          <w:szCs w:val="20"/>
           <w:u w:val="single"/>
         </w:rPr>
-        <w:t xml:space="preserve">Power BI </w:t>
-      </w:r>
-      <w:r>
+        <w:t>Power BI Pages created:</w:t>
+      </w:r>
+    </w:p>
+    <w:p>
+      <w:pPr>
+        <w:pStyle w:val="ListParagraph"/>
+        <w:numPr>
+          <w:ilvl w:val="0"/>
+          <w:numId w:val="7"/>
+        </w:numPr>
+        <w:rPr>
+          <w:sz w:val="20"/>
+          <w:szCs w:val="20"/>
+        </w:rPr>
+      </w:pPr>
+      <w:r>
+        <w:rPr>
+          <w:sz w:val="20"/>
+          <w:szCs w:val="20"/>
+        </w:rPr>
+        <w:t>SALES PERFORMANCE AND REVENUE</w:t>
+      </w:r>
+    </w:p>
+    <w:p>
+      <w:pPr>
+        <w:pStyle w:val="ListParagraph"/>
+        <w:numPr>
+          <w:ilvl w:val="0"/>
+          <w:numId w:val="7"/>
+        </w:numPr>
+        <w:rPr>
+          <w:sz w:val="20"/>
+          <w:szCs w:val="20"/>
+        </w:rPr>
+      </w:pPr>
+      <w:r>
+        <w:rPr>
+          <w:sz w:val="20"/>
+          <w:szCs w:val="20"/>
+        </w:rPr>
+        <w:t>CUSTOMER BEHAVIOR &amp; RETURNS</w:t>
+      </w:r>
+    </w:p>
+    <w:p>
+      <w:pPr>
+        <w:pStyle w:val="ListParagraph"/>
+        <w:numPr>
+          <w:ilvl w:val="0"/>
+          <w:numId w:val="7"/>
+        </w:numPr>
+        <w:rPr>
+          <w:sz w:val="20"/>
+          <w:szCs w:val="20"/>
+        </w:rPr>
+      </w:pPr>
+      <w:r>
+        <w:rPr>
+          <w:sz w:val="20"/>
+          <w:szCs w:val="20"/>
+        </w:rPr>
+        <w:t>INVENTORY &amp; CATEGORY PERFORMANCE</w:t>
+      </w:r>
+    </w:p>
+    <w:p>
+      <w:pPr>
+        <w:rPr>
+          <w:sz w:val="20"/>
+          <w:szCs w:val="20"/>
+        </w:rPr>
+      </w:pPr>
+    </w:p>
+    <w:p>
+      <w:pPr>
+        <w:rPr>
+          <w:sz w:val="20"/>
+          <w:szCs w:val="20"/>
+        </w:rPr>
+      </w:pPr>
+    </w:p>
+    <w:p>
+      <w:pPr>
         <w:rPr>
           <w:b/>
           <w:bCs/>
+          <w:sz w:val="20"/>
+          <w:szCs w:val="20"/>
           <w:u w:val="single"/>
         </w:rPr>
-        <w:t>Pages created:</w:t>
-      </w:r>
-    </w:p>
-    <w:p>
-      <w:pPr>
-        <w:pStyle w:val="ListParagraph"/>
-        <w:numPr>
-          <w:ilvl w:val="0"/>
-          <w:numId w:val="7"/>
-        </w:numPr>
-      </w:pPr>
-      <w:r>
-        <w:t>SALES PERFORMANCE AND REVENUE</w:t>
-      </w:r>
-    </w:p>
-    <w:p>
-      <w:pPr>
-        <w:pStyle w:val="ListParagraph"/>
-        <w:numPr>
-          <w:ilvl w:val="0"/>
-          <w:numId w:val="7"/>
-        </w:numPr>
-      </w:pPr>
-      <w:r>
-        <w:t>CUSTOMER BEHAVIOR &amp; RETURNS</w:t>
-      </w:r>
-    </w:p>
-    <w:p>
-      <w:pPr>
-        <w:pStyle w:val="ListParagraph"/>
-        <w:numPr>
-          <w:ilvl w:val="0"/>
-          <w:numId w:val="7"/>
-        </w:numPr>
-      </w:pPr>
-      <w:r>
-        <w:t>INVENTORY &amp; CATEGORY PERFORMANCE</w:t>
-      </w:r>
-    </w:p>
-    <w:p>
-      <w:pPr>
+      </w:pPr>
+      <w:r>
         <w:rPr>
           <w:b/>
           <w:bCs/>
+          <w:sz w:val="20"/>
+          <w:szCs w:val="20"/>
           <w:u w:val="single"/>
         </w:rPr>
-      </w:pPr>
+        <w:lastRenderedPageBreak/>
+        <w:t xml:space="preserve">Page1: </w:t>
+      </w:r>
       <w:r>
         <w:rPr>
           <w:b/>
           <w:bCs/>
+          <w:sz w:val="20"/>
+          <w:szCs w:val="20"/>
           <w:u w:val="single"/>
         </w:rPr>
-        <w:t xml:space="preserve">Page1: </w:t>
+        <w:t>SALES PERFORMANCE AND REVENUE</w:t>
       </w:r>
       <w:r>
         <w:rPr>
           <w:b/>
           <w:bCs/>
+          <w:sz w:val="20"/>
+          <w:szCs w:val="20"/>
           <w:u w:val="single"/>
         </w:rPr>
-        <w:t>SALES PERFORMANCE AND REVENUE</w:t>
-      </w:r>
-      <w:r>
-        <w:rPr>
-          <w:b/>
-          <w:bCs/>
-          <w:u w:val="single"/>
-        </w:rPr>
         <w:t xml:space="preserve"> </w:t>
       </w:r>
     </w:p>
     <w:p>
+      <w:pPr>
+        <w:rPr>
+          <w:sz w:val="20"/>
+          <w:szCs w:val="20"/>
+        </w:rPr>
+      </w:pPr>
       <w:r>
         <w:rPr>
           <w:noProof/>
+          <w:sz w:val="20"/>
+          <w:szCs w:val="20"/>
         </w:rPr>
         <w:drawing>
           <wp:inline distT="0" distB="0" distL="0" distR="0" wp14:anchorId="0A1B36D0" wp14:editId="0C156F36">
@@ -1235,76 +2199,34 @@
         <w:rPr>
           <w:b/>
           <w:bCs/>
+          <w:sz w:val="20"/>
+          <w:szCs w:val="20"/>
           <w:u w:val="single"/>
         </w:rPr>
       </w:pPr>
-    </w:p>
-    <w:p>
-      <w:pPr>
+      <w:r>
         <w:rPr>
           <w:b/>
           <w:bCs/>
+          <w:sz w:val="20"/>
+          <w:szCs w:val="20"/>
           <w:u w:val="single"/>
         </w:rPr>
-      </w:pPr>
-    </w:p>
-    <w:p>
-      <w:pPr>
-        <w:rPr>
-          <w:b/>
-          <w:bCs/>
-          <w:u w:val="single"/>
-        </w:rPr>
-      </w:pPr>
-    </w:p>
-    <w:p>
-      <w:pPr>
-        <w:rPr>
-          <w:b/>
-          <w:bCs/>
-          <w:u w:val="single"/>
-        </w:rPr>
-      </w:pPr>
-    </w:p>
-    <w:p>
-      <w:pPr>
-        <w:rPr>
-          <w:b/>
-          <w:bCs/>
-          <w:u w:val="single"/>
-        </w:rPr>
-      </w:pPr>
-    </w:p>
-    <w:p>
-      <w:pPr>
-        <w:rPr>
-          <w:b/>
-          <w:bCs/>
-          <w:u w:val="single"/>
-        </w:rPr>
-      </w:pPr>
-      <w:r>
-        <w:rPr>
-          <w:b/>
-          <w:bCs/>
-          <w:u w:val="single"/>
-        </w:rPr>
-        <w:lastRenderedPageBreak/>
-        <w:t>Page</w:t>
-      </w:r>
-      <w:r>
-        <w:rPr>
-          <w:b/>
-          <w:bCs/>
-          <w:u w:val="single"/>
-        </w:rPr>
-        <w:t>2: CUSTOMER BEHAVIOR &amp; RETURNS</w:t>
-      </w:r>
-    </w:p>
-    <w:p>
+        <w:t>Page2: CUSTOMER BEHAVIOR &amp; RETURNS</w:t>
+      </w:r>
+    </w:p>
+    <w:p>
+      <w:pPr>
+        <w:rPr>
+          <w:sz w:val="20"/>
+          <w:szCs w:val="20"/>
+        </w:rPr>
+      </w:pPr>
       <w:r>
         <w:rPr>
           <w:noProof/>
+          <w:sz w:val="20"/>
+          <w:szCs w:val="20"/>
         </w:rPr>
         <w:drawing>
           <wp:inline distT="0" distB="0" distL="0" distR="0" wp14:anchorId="7D75B826" wp14:editId="24FBEB10">
@@ -1356,22 +2278,57 @@
         <w:rPr>
           <w:b/>
           <w:bCs/>
+          <w:sz w:val="20"/>
+          <w:szCs w:val="20"/>
           <w:u w:val="single"/>
         </w:rPr>
       </w:pPr>
-      <w:r>
+    </w:p>
+    <w:p>
+      <w:pPr>
         <w:rPr>
           <w:b/>
           <w:bCs/>
+          <w:sz w:val="20"/>
+          <w:szCs w:val="20"/>
           <w:u w:val="single"/>
         </w:rPr>
+      </w:pPr>
+    </w:p>
+    <w:p>
+      <w:pPr>
+        <w:rPr>
+          <w:b/>
+          <w:bCs/>
+          <w:sz w:val="20"/>
+          <w:szCs w:val="20"/>
+          <w:u w:val="single"/>
+        </w:rPr>
+      </w:pPr>
+      <w:r>
+        <w:rPr>
+          <w:b/>
+          <w:bCs/>
+          <w:sz w:val="20"/>
+          <w:szCs w:val="20"/>
+          <w:u w:val="single"/>
+        </w:rPr>
+        <w:lastRenderedPageBreak/>
         <w:t>Page3: INVENTORY &amp; CATEGORY PERFORMANCE</w:t>
       </w:r>
     </w:p>
     <w:p>
+      <w:pPr>
+        <w:rPr>
+          <w:sz w:val="20"/>
+          <w:szCs w:val="20"/>
+        </w:rPr>
+      </w:pPr>
       <w:r>
         <w:rPr>
           <w:noProof/>
+          <w:sz w:val="20"/>
+          <w:szCs w:val="20"/>
         </w:rPr>
         <w:drawing>
           <wp:inline distT="0" distB="0" distL="0" distR="0" wp14:anchorId="7DF33907" wp14:editId="4BCFE6E7">
@@ -1418,12 +2375,13 @@
         </w:drawing>
       </w:r>
     </w:p>
-    <w:p/>
     <w:p>
       <w:pPr>
         <w:rPr>
           <w:b/>
           <w:bCs/>
+          <w:sz w:val="20"/>
+          <w:szCs w:val="20"/>
           <w:u w:val="single"/>
         </w:rPr>
       </w:pPr>
@@ -1431,16 +2389,25 @@
         <w:rPr>
           <w:b/>
           <w:bCs/>
+          <w:sz w:val="20"/>
+          <w:szCs w:val="20"/>
           <w:u w:val="single"/>
         </w:rPr>
-        <w:lastRenderedPageBreak/>
         <w:t>SQL Server:</w:t>
       </w:r>
     </w:p>
     <w:p>
+      <w:pPr>
+        <w:rPr>
+          <w:sz w:val="20"/>
+          <w:szCs w:val="20"/>
+        </w:rPr>
+      </w:pPr>
       <w:r>
         <w:rPr>
           <w:noProof/>
+          <w:sz w:val="20"/>
+          <w:szCs w:val="20"/>
         </w:rPr>
         <w:drawing>
           <wp:inline distT="0" distB="0" distL="0" distR="0" wp14:anchorId="0236B912" wp14:editId="431DC1EC">
@@ -1487,11 +2454,40 @@
         </w:drawing>
       </w:r>
     </w:p>
-    <w:p/>
-    <w:p/>
-    <w:p>
-      <w:r>
-        <w:t>-----------------------------------------------------------END---------------------------------------------------</w:t>
+    <w:p>
+      <w:pPr>
+        <w:rPr>
+          <w:sz w:val="20"/>
+          <w:szCs w:val="20"/>
+        </w:rPr>
+      </w:pPr>
+      <w:r>
+        <w:rPr>
+          <w:sz w:val="20"/>
+          <w:szCs w:val="20"/>
+        </w:rPr>
+        <w:t>---------------------------------------------------------</w:t>
+      </w:r>
+      <w:r>
+        <w:rPr>
+          <w:sz w:val="20"/>
+          <w:szCs w:val="20"/>
+        </w:rPr>
+        <w:t>-------------</w:t>
+      </w:r>
+      <w:r>
+        <w:rPr>
+          <w:sz w:val="20"/>
+          <w:szCs w:val="20"/>
+        </w:rPr>
+        <w:t>--END---------------------------------------------------</w:t>
+      </w:r>
+      <w:r>
+        <w:rPr>
+          <w:sz w:val="20"/>
+          <w:szCs w:val="20"/>
+        </w:rPr>
+        <w:t>-----------</w:t>
       </w:r>
     </w:p>
     <w:sectPr>

</xml_diff>

<commit_message>
Power BI Data Analytics
</commit_message>
<xml_diff>
--- a/Power_BI_Data_Analytics.docx
+++ b/Power_BI_Data_Analytics.docx
@@ -9,17 +9,13 @@
         <w:rPr>
           <w:b/>
           <w:bCs/>
-          <w:sz w:val="20"/>
-          <w:szCs w:val="20"/>
-          <w:u w:val="single"/>
-        </w:rPr>
-      </w:pPr>
-      <w:r>
-        <w:rPr>
-          <w:b/>
-          <w:bCs/>
-          <w:sz w:val="20"/>
-          <w:szCs w:val="20"/>
+          <w:u w:val="single"/>
+        </w:rPr>
+      </w:pPr>
+      <w:r>
+        <w:rPr>
+          <w:b/>
+          <w:bCs/>
           <w:u w:val="single"/>
         </w:rPr>
         <w:t>Power BI Data Analytics</w:t>
@@ -32,17 +28,13 @@
         <w:rPr>
           <w:b/>
           <w:bCs/>
-          <w:sz w:val="20"/>
-          <w:szCs w:val="20"/>
-          <w:u w:val="single"/>
-        </w:rPr>
-      </w:pPr>
-      <w:r>
-        <w:rPr>
-          <w:b/>
-          <w:bCs/>
-          <w:sz w:val="20"/>
-          <w:szCs w:val="20"/>
+          <w:u w:val="single"/>
+        </w:rPr>
+      </w:pPr>
+      <w:r>
+        <w:rPr>
+          <w:b/>
+          <w:bCs/>
           <w:u w:val="single"/>
         </w:rPr>
         <w:t>3/1/2026</w:t>
@@ -54,17 +46,13 @@
         <w:rPr>
           <w:b/>
           <w:bCs/>
-          <w:sz w:val="20"/>
-          <w:szCs w:val="20"/>
-          <w:u w:val="single"/>
-        </w:rPr>
-      </w:pPr>
-      <w:r>
-        <w:rPr>
-          <w:b/>
-          <w:bCs/>
-          <w:sz w:val="20"/>
-          <w:szCs w:val="20"/>
+          <w:u w:val="single"/>
+        </w:rPr>
+      </w:pPr>
+      <w:r>
+        <w:rPr>
+          <w:b/>
+          <w:bCs/>
           <w:u w:val="single"/>
         </w:rPr>
         <w:t>Objective</w:t>
@@ -73,8 +61,6 @@
         <w:rPr>
           <w:b/>
           <w:bCs/>
-          <w:sz w:val="20"/>
-          <w:szCs w:val="20"/>
           <w:u w:val="single"/>
         </w:rPr>
         <w:t>:</w:t>
@@ -87,17 +73,12 @@
           <w:ilvl w:val="0"/>
           <w:numId w:val="4"/>
         </w:numPr>
-        <w:rPr>
-          <w:sz w:val="20"/>
-          <w:szCs w:val="20"/>
-        </w:rPr>
-      </w:pPr>
-      <w:r>
-        <w:rPr>
-          <w:sz w:val="20"/>
-          <w:szCs w:val="20"/>
-        </w:rPr>
-        <w:t xml:space="preserve">Install &amp; config SQL Server &amp; SSMS </w:t>
+      </w:pPr>
+      <w:r>
+        <w:t xml:space="preserve">Install </w:t>
+      </w:r>
+      <w:r>
+        <w:t xml:space="preserve">&amp; config SQL Server &amp; SSMS </w:t>
       </w:r>
     </w:p>
     <w:p>
@@ -107,16 +88,8 @@
           <w:ilvl w:val="0"/>
           <w:numId w:val="4"/>
         </w:numPr>
-        <w:rPr>
-          <w:sz w:val="20"/>
-          <w:szCs w:val="20"/>
-        </w:rPr>
-      </w:pPr>
-      <w:r>
-        <w:rPr>
-          <w:sz w:val="20"/>
-          <w:szCs w:val="20"/>
-        </w:rPr>
+      </w:pPr>
+      <w:r>
         <w:t>Implementing data import techniques from various sources into SQL Server and Power BI</w:t>
       </w:r>
     </w:p>
@@ -127,16 +100,8 @@
           <w:ilvl w:val="0"/>
           <w:numId w:val="4"/>
         </w:numPr>
-        <w:rPr>
-          <w:sz w:val="20"/>
-          <w:szCs w:val="20"/>
-        </w:rPr>
-      </w:pPr>
-      <w:r>
-        <w:rPr>
-          <w:sz w:val="20"/>
-          <w:szCs w:val="20"/>
-        </w:rPr>
+      </w:pPr>
+      <w:r>
         <w:t>Applying data profiling and cleaning methods to ensure data quality and consistency</w:t>
       </w:r>
     </w:p>
@@ -147,16 +112,8 @@
           <w:ilvl w:val="0"/>
           <w:numId w:val="4"/>
         </w:numPr>
-        <w:rPr>
-          <w:sz w:val="20"/>
-          <w:szCs w:val="20"/>
-        </w:rPr>
-      </w:pPr>
-      <w:r>
-        <w:rPr>
-          <w:sz w:val="20"/>
-          <w:szCs w:val="20"/>
-        </w:rPr>
+      </w:pPr>
+      <w:r>
         <w:t>Building calculated columns and custom measures using Data Analysis Expression (DAX) in Power BI</w:t>
       </w:r>
     </w:p>
@@ -167,16 +124,8 @@
           <w:ilvl w:val="0"/>
           <w:numId w:val="4"/>
         </w:numPr>
-        <w:rPr>
-          <w:sz w:val="20"/>
-          <w:szCs w:val="20"/>
-        </w:rPr>
-      </w:pPr>
-      <w:r>
-        <w:rPr>
-          <w:sz w:val="20"/>
-          <w:szCs w:val="20"/>
-        </w:rPr>
+      </w:pPr>
+      <w:r>
         <w:t xml:space="preserve">Analyzing sales, returns, and inventory data to identify trends and patterns </w:t>
       </w:r>
     </w:p>
@@ -187,16 +136,8 @@
           <w:ilvl w:val="0"/>
           <w:numId w:val="4"/>
         </w:numPr>
-        <w:rPr>
-          <w:sz w:val="20"/>
-          <w:szCs w:val="20"/>
-        </w:rPr>
-      </w:pPr>
-      <w:r>
-        <w:rPr>
-          <w:sz w:val="20"/>
-          <w:szCs w:val="20"/>
-        </w:rPr>
+      </w:pPr>
+      <w:r>
         <w:t xml:space="preserve">Designing interactive Power BI reports with effective visualizations to communicate insights </w:t>
       </w:r>
     </w:p>
@@ -207,16 +148,8 @@
           <w:ilvl w:val="0"/>
           <w:numId w:val="4"/>
         </w:numPr>
-        <w:rPr>
-          <w:sz w:val="20"/>
-          <w:szCs w:val="20"/>
-        </w:rPr>
-      </w:pPr>
-      <w:r>
-        <w:rPr>
-          <w:sz w:val="20"/>
-          <w:szCs w:val="20"/>
-        </w:rPr>
+      </w:pPr>
+      <w:r>
         <w:t>Optimizing Power BI reports for performance and accessibility</w:t>
       </w:r>
     </w:p>
@@ -226,84 +159,44 @@
         <w:rPr>
           <w:b/>
           <w:bCs/>
-          <w:sz w:val="20"/>
-          <w:szCs w:val="20"/>
-          <w:u w:val="single"/>
-        </w:rPr>
-      </w:pPr>
-    </w:p>
-    <w:p>
-      <w:pPr>
-        <w:pStyle w:val="NoSpacing"/>
-        <w:rPr>
-          <w:b/>
-          <w:bCs/>
-          <w:sz w:val="20"/>
-          <w:szCs w:val="20"/>
-          <w:u w:val="single"/>
-        </w:rPr>
-      </w:pPr>
-      <w:r>
-        <w:rPr>
-          <w:b/>
-          <w:bCs/>
-          <w:sz w:val="20"/>
-          <w:szCs w:val="20"/>
-          <w:u w:val="single"/>
-        </w:rPr>
-        <w:t>High-level system</w:t>
-      </w:r>
-      <w:r>
-        <w:rPr>
-          <w:b/>
-          <w:bCs/>
-          <w:sz w:val="20"/>
-          <w:szCs w:val="20"/>
-          <w:u w:val="single"/>
-        </w:rPr>
-        <w:t xml:space="preserve"> </w:t>
-      </w:r>
-      <w:r>
-        <w:rPr>
-          <w:b/>
-          <w:bCs/>
-          <w:sz w:val="20"/>
-          <w:szCs w:val="20"/>
-          <w:u w:val="single"/>
-        </w:rPr>
-        <w:t>a</w:t>
-      </w:r>
-      <w:r>
-        <w:rPr>
-          <w:b/>
-          <w:bCs/>
-          <w:sz w:val="20"/>
-          <w:szCs w:val="20"/>
-          <w:u w:val="single"/>
-        </w:rPr>
-        <w:t>rchitecture:</w:t>
-      </w:r>
-    </w:p>
-    <w:p>
-      <w:pPr>
-        <w:pStyle w:val="NoSpacing"/>
-        <w:rPr>
-          <w:b/>
-          <w:bCs/>
-          <w:sz w:val="20"/>
-          <w:szCs w:val="20"/>
-          <w:u w:val="single"/>
-        </w:rPr>
-      </w:pPr>
-    </w:p>
-    <w:p>
-      <w:pPr>
-        <w:pStyle w:val="NoSpacing"/>
-        <w:rPr>
-          <w:b/>
-          <w:bCs/>
-          <w:sz w:val="20"/>
-          <w:szCs w:val="20"/>
+          <w:u w:val="single"/>
+        </w:rPr>
+      </w:pPr>
+    </w:p>
+    <w:p>
+      <w:pPr>
+        <w:pStyle w:val="NoSpacing"/>
+        <w:rPr>
+          <w:b/>
+          <w:bCs/>
+          <w:u w:val="single"/>
+        </w:rPr>
+      </w:pPr>
+      <w:r>
+        <w:rPr>
+          <w:b/>
+          <w:bCs/>
+          <w:u w:val="single"/>
+        </w:rPr>
+        <w:t>Project Architecture:</w:t>
+      </w:r>
+    </w:p>
+    <w:p>
+      <w:pPr>
+        <w:pStyle w:val="NoSpacing"/>
+        <w:rPr>
+          <w:b/>
+          <w:bCs/>
+          <w:u w:val="single"/>
+        </w:rPr>
+      </w:pPr>
+    </w:p>
+    <w:p>
+      <w:pPr>
+        <w:pStyle w:val="NoSpacing"/>
+        <w:rPr>
+          <w:b/>
+          <w:bCs/>
           <w:u w:val="single"/>
         </w:rPr>
       </w:pPr>
@@ -312,8 +205,6 @@
           <w:b/>
           <w:bCs/>
           <w:noProof/>
-          <w:sz w:val="20"/>
-          <w:szCs w:val="20"/>
           <w:u w:val="single"/>
         </w:rPr>
         <w:drawing>
@@ -372,29 +263,23 @@
         <w:rPr>
           <w:b/>
           <w:bCs/>
-          <w:sz w:val="20"/>
-          <w:szCs w:val="20"/>
-          <w:u w:val="single"/>
-        </w:rPr>
-      </w:pPr>
-    </w:p>
-    <w:p>
-      <w:pPr>
-        <w:pStyle w:val="NoSpacing"/>
-        <w:rPr>
-          <w:b/>
-          <w:bCs/>
-          <w:sz w:val="20"/>
-          <w:szCs w:val="20"/>
-          <w:u w:val="single"/>
-        </w:rPr>
-      </w:pPr>
-      <w:r>
-        <w:rPr>
-          <w:b/>
-          <w:bCs/>
-          <w:sz w:val="20"/>
-          <w:szCs w:val="20"/>
+          <w:u w:val="single"/>
+        </w:rPr>
+      </w:pPr>
+    </w:p>
+    <w:p>
+      <w:pPr>
+        <w:pStyle w:val="NoSpacing"/>
+        <w:rPr>
+          <w:b/>
+          <w:bCs/>
+          <w:u w:val="single"/>
+        </w:rPr>
+      </w:pPr>
+      <w:r>
+        <w:rPr>
+          <w:b/>
+          <w:bCs/>
           <w:u w:val="single"/>
         </w:rPr>
         <w:t>Tech stack:</w:t>
@@ -407,16 +292,8 @@
           <w:ilvl w:val="0"/>
           <w:numId w:val="3"/>
         </w:numPr>
-        <w:rPr>
-          <w:sz w:val="20"/>
-          <w:szCs w:val="20"/>
-        </w:rPr>
-      </w:pPr>
-      <w:r>
-        <w:rPr>
-          <w:sz w:val="20"/>
-          <w:szCs w:val="20"/>
-        </w:rPr>
+      </w:pPr>
+      <w:r>
         <w:t>Microsoft Power BI Desktop</w:t>
       </w:r>
     </w:p>
@@ -427,24 +304,9 @@
           <w:ilvl w:val="0"/>
           <w:numId w:val="3"/>
         </w:numPr>
-        <w:rPr>
-          <w:sz w:val="20"/>
-          <w:szCs w:val="20"/>
-        </w:rPr>
-      </w:pPr>
-      <w:r>
-        <w:rPr>
-          <w:sz w:val="20"/>
-          <w:szCs w:val="20"/>
-        </w:rPr>
-        <w:t xml:space="preserve">SQL Server </w:t>
-      </w:r>
-      <w:r>
-        <w:rPr>
-          <w:sz w:val="20"/>
-          <w:szCs w:val="20"/>
-        </w:rPr>
-        <w:t>2025</w:t>
+      </w:pPr>
+      <w:r>
+        <w:t xml:space="preserve">SQL Server Management Studio (SSMS) </w:t>
       </w:r>
     </w:p>
     <w:p>
@@ -454,50 +316,11 @@
           <w:ilvl w:val="0"/>
           <w:numId w:val="3"/>
         </w:numPr>
-        <w:rPr>
-          <w:sz w:val="20"/>
-          <w:szCs w:val="20"/>
-        </w:rPr>
-      </w:pPr>
-      <w:r>
-        <w:rPr>
-          <w:sz w:val="20"/>
-          <w:szCs w:val="20"/>
-        </w:rPr>
-        <w:t xml:space="preserve">SQL Server Management Studio (SSMS) </w:t>
-      </w:r>
-      <w:r>
-        <w:rPr>
-          <w:sz w:val="20"/>
-          <w:szCs w:val="20"/>
-        </w:rPr>
-        <w:t>22.2.1</w:t>
-      </w:r>
-    </w:p>
-    <w:p>
-      <w:pPr>
-        <w:pStyle w:val="NoSpacing"/>
-        <w:numPr>
-          <w:ilvl w:val="0"/>
-          <w:numId w:val="3"/>
-        </w:numPr>
-        <w:rPr>
-          <w:sz w:val="20"/>
-          <w:szCs w:val="20"/>
-        </w:rPr>
-      </w:pPr>
-      <w:r>
-        <w:rPr>
-          <w:sz w:val="20"/>
-          <w:szCs w:val="20"/>
-        </w:rPr>
+      </w:pPr>
+      <w:r>
         <w:t xml:space="preserve">Fashion_dataset.csv </w:t>
       </w:r>
       <w:r>
-        <w:rPr>
-          <w:sz w:val="20"/>
-          <w:szCs w:val="20"/>
-        </w:rPr>
         <w:object w:dxaOrig="1541" w:dyaOrig="998" w14:anchorId="0C0BC410">
           <v:shapetype id="_x0000_t75" coordsize="21600,21600" o:spt="75" o:preferrelative="t" path="m@4@5l@4@11@9@11@9@5xe" filled="f" stroked="f">
             <v:stroke joinstyle="miter"/>
@@ -518,13 +341,13 @@
             <v:path o:extrusionok="f" gradientshapeok="t" o:connecttype="rect"/>
             <o:lock v:ext="edit" aspectratio="t"/>
           </v:shapetype>
-          <v:shape id="_x0000_i1025" type="#_x0000_t75" style="width:77.15pt;height:50.05pt" o:ole="">
+          <v:shape id="_x0000_i1025" type="#_x0000_t75" style="width:77pt;height:50.1pt" o:ole="">
             <v:imagedata r:id="rId7" o:title=""/>
           </v:shape>
           <o:OLEObject Type="Link" ProgID="Excel.SheetMacroEnabled.12" ShapeID="_x0000_i1025" DrawAspect="Icon" r:id="rId8" UpdateMode="Always">
             <o:LinkType>EnhancedMetaFile</o:LinkType>
             <o:LockedField>false</o:LockedField>
-            <o:FieldCodes>\f 0 \* MERGEFORMAT</o:FieldCodes>
+            <o:FieldCodes>\f 0</o:FieldCodes>
           </o:OLEObject>
         </w:object>
       </w:r>
@@ -532,29 +355,21 @@
     <w:p>
       <w:pPr>
         <w:pStyle w:val="NoSpacing"/>
-        <w:rPr>
-          <w:sz w:val="20"/>
-          <w:szCs w:val="20"/>
-        </w:rPr>
-      </w:pPr>
-    </w:p>
-    <w:p>
-      <w:pPr>
-        <w:pStyle w:val="NoSpacing"/>
-        <w:rPr>
-          <w:b/>
-          <w:bCs/>
-          <w:sz w:val="20"/>
-          <w:szCs w:val="20"/>
-          <w:u w:val="single"/>
-        </w:rPr>
-      </w:pPr>
-      <w:r>
-        <w:rPr>
-          <w:b/>
-          <w:bCs/>
-          <w:sz w:val="20"/>
-          <w:szCs w:val="20"/>
+      </w:pPr>
+    </w:p>
+    <w:p>
+      <w:pPr>
+        <w:pStyle w:val="NoSpacing"/>
+        <w:rPr>
+          <w:b/>
+          <w:bCs/>
+          <w:u w:val="single"/>
+        </w:rPr>
+      </w:pPr>
+      <w:r>
+        <w:rPr>
+          <w:b/>
+          <w:bCs/>
           <w:u w:val="single"/>
         </w:rPr>
         <w:t>Tasks performed:</w:t>
@@ -567,30 +382,14 @@
           <w:ilvl w:val="0"/>
           <w:numId w:val="2"/>
         </w:numPr>
-        <w:rPr>
-          <w:sz w:val="20"/>
-          <w:szCs w:val="20"/>
-        </w:rPr>
-      </w:pPr>
-      <w:r>
-        <w:rPr>
-          <w:sz w:val="20"/>
-          <w:szCs w:val="20"/>
-        </w:rPr>
+      </w:pPr>
+      <w:r>
         <w:t>Importing the data</w:t>
       </w:r>
       <w:r>
-        <w:rPr>
-          <w:sz w:val="20"/>
-          <w:szCs w:val="20"/>
-        </w:rPr>
         <w:t xml:space="preserve"> (fashion_dataset.csv) </w:t>
       </w:r>
       <w:r>
-        <w:rPr>
-          <w:sz w:val="20"/>
-          <w:szCs w:val="20"/>
-        </w:rPr>
         <w:t>using “Import Flat File” on database</w:t>
       </w:r>
     </w:p>
@@ -601,16 +400,8 @@
           <w:ilvl w:val="1"/>
           <w:numId w:val="2"/>
         </w:numPr>
-        <w:rPr>
-          <w:sz w:val="20"/>
-          <w:szCs w:val="20"/>
-        </w:rPr>
-      </w:pPr>
-      <w:r>
-        <w:rPr>
-          <w:sz w:val="20"/>
-          <w:szCs w:val="20"/>
-        </w:rPr>
+      </w:pPr>
+      <w:r>
         <w:t xml:space="preserve">Importing data to SQL server </w:t>
       </w:r>
     </w:p>
@@ -621,16 +412,8 @@
           <w:ilvl w:val="1"/>
           <w:numId w:val="2"/>
         </w:numPr>
-        <w:rPr>
-          <w:sz w:val="20"/>
-          <w:szCs w:val="20"/>
-        </w:rPr>
-      </w:pPr>
-      <w:r>
-        <w:rPr>
-          <w:sz w:val="20"/>
-          <w:szCs w:val="20"/>
-        </w:rPr>
+      </w:pPr>
+      <w:r>
         <w:t xml:space="preserve">Importing data to Power BI Desktop </w:t>
       </w:r>
     </w:p>
@@ -638,10 +421,6 @@
       <w:pPr>
         <w:pStyle w:val="NoSpacing"/>
         <w:ind w:left="1440"/>
-        <w:rPr>
-          <w:sz w:val="20"/>
-          <w:szCs w:val="20"/>
-        </w:rPr>
       </w:pPr>
     </w:p>
     <w:p>
@@ -651,16 +430,8 @@
           <w:ilvl w:val="0"/>
           <w:numId w:val="2"/>
         </w:numPr>
-        <w:rPr>
-          <w:sz w:val="20"/>
-          <w:szCs w:val="20"/>
-        </w:rPr>
-      </w:pPr>
-      <w:r>
-        <w:rPr>
-          <w:sz w:val="20"/>
-          <w:szCs w:val="20"/>
-        </w:rPr>
+      </w:pPr>
+      <w:r>
         <w:t xml:space="preserve">Data Profiling &amp; Cleaning </w:t>
       </w:r>
     </w:p>
@@ -671,16 +442,8 @@
           <w:ilvl w:val="1"/>
           <w:numId w:val="2"/>
         </w:numPr>
-        <w:rPr>
-          <w:sz w:val="20"/>
-          <w:szCs w:val="20"/>
-        </w:rPr>
-      </w:pPr>
-      <w:r>
-        <w:rPr>
-          <w:sz w:val="20"/>
-          <w:szCs w:val="20"/>
-        </w:rPr>
+      </w:pPr>
+      <w:r>
         <w:t xml:space="preserve">Data Profiling and Data Types </w:t>
       </w:r>
     </w:p>
@@ -691,16 +454,8 @@
           <w:ilvl w:val="1"/>
           <w:numId w:val="2"/>
         </w:numPr>
-        <w:rPr>
-          <w:sz w:val="20"/>
-          <w:szCs w:val="20"/>
-        </w:rPr>
-      </w:pPr>
-      <w:r>
-        <w:rPr>
-          <w:sz w:val="20"/>
-          <w:szCs w:val="20"/>
-        </w:rPr>
+      </w:pPr>
+      <w:r>
         <w:t xml:space="preserve">Replacing null values </w:t>
       </w:r>
     </w:p>
@@ -711,16 +466,9 @@
           <w:ilvl w:val="1"/>
           <w:numId w:val="2"/>
         </w:numPr>
-        <w:rPr>
-          <w:sz w:val="20"/>
-          <w:szCs w:val="20"/>
-        </w:rPr>
-      </w:pPr>
-      <w:r>
-        <w:rPr>
-          <w:sz w:val="20"/>
-          <w:szCs w:val="20"/>
-        </w:rPr>
+      </w:pPr>
+      <w:r>
+        <w:lastRenderedPageBreak/>
         <w:t>Adding Rating Category column</w:t>
       </w:r>
     </w:p>
@@ -728,10 +476,6 @@
       <w:pPr>
         <w:pStyle w:val="NoSpacing"/>
         <w:ind w:left="1440"/>
-        <w:rPr>
-          <w:sz w:val="20"/>
-          <w:szCs w:val="20"/>
-        </w:rPr>
       </w:pPr>
     </w:p>
     <w:p>
@@ -741,16 +485,8 @@
           <w:ilvl w:val="0"/>
           <w:numId w:val="2"/>
         </w:numPr>
-        <w:rPr>
-          <w:sz w:val="20"/>
-          <w:szCs w:val="20"/>
-        </w:rPr>
-      </w:pPr>
-      <w:r>
-        <w:rPr>
-          <w:sz w:val="20"/>
-          <w:szCs w:val="20"/>
-        </w:rPr>
+      </w:pPr>
+      <w:r>
         <w:t xml:space="preserve">Data Transformation Steps </w:t>
       </w:r>
     </w:p>
@@ -761,16 +497,8 @@
           <w:ilvl w:val="1"/>
           <w:numId w:val="2"/>
         </w:numPr>
-        <w:rPr>
-          <w:sz w:val="20"/>
-          <w:szCs w:val="20"/>
-        </w:rPr>
-      </w:pPr>
-      <w:r>
-        <w:rPr>
-          <w:sz w:val="20"/>
-          <w:szCs w:val="20"/>
-        </w:rPr>
+      </w:pPr>
+      <w:r>
         <w:t xml:space="preserve">Data cleaning </w:t>
       </w:r>
     </w:p>
@@ -781,26 +509,14 @@
           <w:ilvl w:val="1"/>
           <w:numId w:val="2"/>
         </w:numPr>
-        <w:rPr>
-          <w:sz w:val="20"/>
-          <w:szCs w:val="20"/>
-        </w:rPr>
-      </w:pPr>
-      <w:r>
-        <w:rPr>
-          <w:sz w:val="20"/>
-          <w:szCs w:val="20"/>
-        </w:rPr>
+      </w:pPr>
+      <w:r>
         <w:t xml:space="preserve">Adding custom discount column </w:t>
       </w:r>
     </w:p>
     <w:p>
       <w:pPr>
         <w:pStyle w:val="NoSpacing"/>
-        <w:rPr>
-          <w:sz w:val="20"/>
-          <w:szCs w:val="20"/>
-        </w:rPr>
       </w:pPr>
     </w:p>
     <w:p>
@@ -810,16 +526,8 @@
           <w:ilvl w:val="0"/>
           <w:numId w:val="2"/>
         </w:numPr>
-        <w:rPr>
-          <w:sz w:val="20"/>
-          <w:szCs w:val="20"/>
-        </w:rPr>
-      </w:pPr>
-      <w:r>
-        <w:rPr>
-          <w:sz w:val="20"/>
-          <w:szCs w:val="20"/>
-        </w:rPr>
+      </w:pPr>
+      <w:r>
         <w:t>Sales Performance &amp; Revenue</w:t>
       </w:r>
     </w:p>
@@ -830,16 +538,8 @@
           <w:ilvl w:val="1"/>
           <w:numId w:val="2"/>
         </w:numPr>
-        <w:rPr>
-          <w:sz w:val="20"/>
-          <w:szCs w:val="20"/>
-        </w:rPr>
-      </w:pPr>
-      <w:r>
-        <w:rPr>
-          <w:sz w:val="20"/>
-          <w:szCs w:val="20"/>
-        </w:rPr>
+      </w:pPr>
+      <w:r>
         <w:t xml:space="preserve">Total sales KPI card </w:t>
       </w:r>
     </w:p>
@@ -850,17 +550,8 @@
           <w:ilvl w:val="1"/>
           <w:numId w:val="2"/>
         </w:numPr>
-        <w:rPr>
-          <w:sz w:val="20"/>
-          <w:szCs w:val="20"/>
-        </w:rPr>
-      </w:pPr>
-      <w:r>
-        <w:rPr>
-          <w:sz w:val="20"/>
-          <w:szCs w:val="20"/>
-        </w:rPr>
-        <w:lastRenderedPageBreak/>
+      </w:pPr>
+      <w:r>
         <w:t xml:space="preserve">Avg. Order Value &amp; Units Sold </w:t>
       </w:r>
     </w:p>
@@ -871,26 +562,14 @@
           <w:ilvl w:val="1"/>
           <w:numId w:val="2"/>
         </w:numPr>
-        <w:rPr>
-          <w:sz w:val="20"/>
-          <w:szCs w:val="20"/>
-        </w:rPr>
-      </w:pPr>
-      <w:r>
-        <w:rPr>
-          <w:sz w:val="20"/>
-          <w:szCs w:val="20"/>
-        </w:rPr>
+      </w:pPr>
+      <w:r>
         <w:t>Revenue by Brand</w:t>
       </w:r>
     </w:p>
     <w:p>
       <w:pPr>
         <w:pStyle w:val="NoSpacing"/>
-        <w:rPr>
-          <w:sz w:val="20"/>
-          <w:szCs w:val="20"/>
-        </w:rPr>
       </w:pPr>
     </w:p>
     <w:p>
@@ -900,16 +579,8 @@
           <w:ilvl w:val="0"/>
           <w:numId w:val="2"/>
         </w:numPr>
-        <w:rPr>
-          <w:sz w:val="20"/>
-          <w:szCs w:val="20"/>
-        </w:rPr>
-      </w:pPr>
-      <w:r>
-        <w:rPr>
-          <w:sz w:val="20"/>
-          <w:szCs w:val="20"/>
-        </w:rPr>
+      </w:pPr>
+      <w:r>
         <w:t xml:space="preserve">Customer Behavior &amp; Returns </w:t>
       </w:r>
     </w:p>
@@ -920,16 +591,8 @@
           <w:ilvl w:val="1"/>
           <w:numId w:val="2"/>
         </w:numPr>
-        <w:rPr>
-          <w:sz w:val="20"/>
-          <w:szCs w:val="20"/>
-        </w:rPr>
-      </w:pPr>
-      <w:r>
-        <w:rPr>
-          <w:sz w:val="20"/>
-          <w:szCs w:val="20"/>
-        </w:rPr>
+      </w:pPr>
+      <w:r>
         <w:t xml:space="preserve">Creating report page </w:t>
       </w:r>
     </w:p>
@@ -940,16 +603,8 @@
           <w:ilvl w:val="1"/>
           <w:numId w:val="2"/>
         </w:numPr>
-        <w:rPr>
-          <w:sz w:val="20"/>
-          <w:szCs w:val="20"/>
-        </w:rPr>
-      </w:pPr>
-      <w:r>
-        <w:rPr>
-          <w:sz w:val="20"/>
-          <w:szCs w:val="20"/>
-        </w:rPr>
+      </w:pPr>
+      <w:r>
         <w:t xml:space="preserve">Return by Return Reasons </w:t>
       </w:r>
     </w:p>
@@ -960,16 +615,8 @@
           <w:ilvl w:val="1"/>
           <w:numId w:val="2"/>
         </w:numPr>
-        <w:rPr>
-          <w:sz w:val="20"/>
-          <w:szCs w:val="20"/>
-        </w:rPr>
-      </w:pPr>
-      <w:r>
-        <w:rPr>
-          <w:sz w:val="20"/>
-          <w:szCs w:val="20"/>
-        </w:rPr>
+      </w:pPr>
+      <w:r>
         <w:t xml:space="preserve">Number of reasons by season </w:t>
       </w:r>
     </w:p>
@@ -980,16 +627,8 @@
           <w:ilvl w:val="1"/>
           <w:numId w:val="2"/>
         </w:numPr>
-        <w:rPr>
-          <w:sz w:val="20"/>
-          <w:szCs w:val="20"/>
-        </w:rPr>
-      </w:pPr>
-      <w:r>
-        <w:rPr>
-          <w:sz w:val="20"/>
-          <w:szCs w:val="20"/>
-        </w:rPr>
+      </w:pPr>
+      <w:r>
         <w:t xml:space="preserve">Return Category </w:t>
       </w:r>
     </w:p>
@@ -1000,26 +639,14 @@
           <w:ilvl w:val="1"/>
           <w:numId w:val="2"/>
         </w:numPr>
-        <w:rPr>
-          <w:sz w:val="20"/>
-          <w:szCs w:val="20"/>
-        </w:rPr>
-      </w:pPr>
-      <w:r>
-        <w:rPr>
-          <w:sz w:val="20"/>
-          <w:szCs w:val="20"/>
-        </w:rPr>
+      </w:pPr>
+      <w:r>
         <w:t>Returns by Rating Category</w:t>
       </w:r>
     </w:p>
     <w:p>
       <w:pPr>
         <w:pStyle w:val="NoSpacing"/>
-        <w:rPr>
-          <w:sz w:val="20"/>
-          <w:szCs w:val="20"/>
-        </w:rPr>
       </w:pPr>
     </w:p>
     <w:p>
@@ -1029,16 +656,8 @@
           <w:ilvl w:val="0"/>
           <w:numId w:val="2"/>
         </w:numPr>
-        <w:rPr>
-          <w:sz w:val="20"/>
-          <w:szCs w:val="20"/>
-        </w:rPr>
-      </w:pPr>
-      <w:r>
-        <w:rPr>
-          <w:sz w:val="20"/>
-          <w:szCs w:val="20"/>
-        </w:rPr>
+      </w:pPr>
+      <w:r>
         <w:t xml:space="preserve">Inventory &amp; Category </w:t>
       </w:r>
     </w:p>
@@ -1049,16 +668,8 @@
           <w:ilvl w:val="1"/>
           <w:numId w:val="2"/>
         </w:numPr>
-        <w:rPr>
-          <w:sz w:val="20"/>
-          <w:szCs w:val="20"/>
-        </w:rPr>
-      </w:pPr>
-      <w:r>
-        <w:rPr>
-          <w:sz w:val="20"/>
-          <w:szCs w:val="20"/>
-        </w:rPr>
+      </w:pPr>
+      <w:r>
         <w:t>Creating a Report page – Inventory &amp; Category Performance</w:t>
       </w:r>
     </w:p>
@@ -1069,16 +680,8 @@
           <w:ilvl w:val="1"/>
           <w:numId w:val="2"/>
         </w:numPr>
-        <w:rPr>
-          <w:sz w:val="20"/>
-          <w:szCs w:val="20"/>
-        </w:rPr>
-      </w:pPr>
-      <w:r>
-        <w:rPr>
-          <w:sz w:val="20"/>
-          <w:szCs w:val="20"/>
-        </w:rPr>
+      </w:pPr>
+      <w:r>
         <w:t xml:space="preserve">Stock Quantity by Brand &amp; Category </w:t>
       </w:r>
     </w:p>
@@ -1089,16 +692,8 @@
           <w:ilvl w:val="1"/>
           <w:numId w:val="2"/>
         </w:numPr>
-        <w:rPr>
-          <w:sz w:val="20"/>
-          <w:szCs w:val="20"/>
-        </w:rPr>
-      </w:pPr>
-      <w:r>
-        <w:rPr>
-          <w:sz w:val="20"/>
-          <w:szCs w:val="20"/>
-        </w:rPr>
+      </w:pPr>
+      <w:r>
         <w:t xml:space="preserve">Units Sold by Month </w:t>
       </w:r>
     </w:p>
@@ -1109,16 +704,8 @@
           <w:ilvl w:val="1"/>
           <w:numId w:val="2"/>
         </w:numPr>
-        <w:rPr>
-          <w:sz w:val="20"/>
-          <w:szCs w:val="20"/>
-        </w:rPr>
-      </w:pPr>
-      <w:r>
-        <w:rPr>
-          <w:sz w:val="20"/>
-          <w:szCs w:val="20"/>
-        </w:rPr>
+      </w:pPr>
+      <w:r>
         <w:t xml:space="preserve">Avg. Order Value by Category </w:t>
       </w:r>
     </w:p>
@@ -1129,26 +716,14 @@
           <w:ilvl w:val="1"/>
           <w:numId w:val="2"/>
         </w:numPr>
-        <w:rPr>
-          <w:sz w:val="20"/>
-          <w:szCs w:val="20"/>
-        </w:rPr>
-      </w:pPr>
-      <w:r>
-        <w:rPr>
-          <w:sz w:val="20"/>
-          <w:szCs w:val="20"/>
-        </w:rPr>
+      </w:pPr>
+      <w:r>
         <w:t xml:space="preserve">Avg. Order Value by Brand </w:t>
       </w:r>
     </w:p>
     <w:p>
       <w:pPr>
         <w:pStyle w:val="NoSpacing"/>
-        <w:rPr>
-          <w:sz w:val="20"/>
-          <w:szCs w:val="20"/>
-        </w:rPr>
       </w:pPr>
     </w:p>
     <w:p>
@@ -1158,73 +733,41 @@
           <w:ilvl w:val="0"/>
           <w:numId w:val="2"/>
         </w:numPr>
-        <w:rPr>
-          <w:sz w:val="20"/>
-          <w:szCs w:val="20"/>
-        </w:rPr>
-      </w:pPr>
-      <w:r>
-        <w:rPr>
-          <w:sz w:val="20"/>
-          <w:szCs w:val="20"/>
-        </w:rPr>
+      </w:pPr>
+      <w:r>
         <w:t xml:space="preserve">Refresh the </w:t>
       </w:r>
       <w:r>
-        <w:rPr>
-          <w:sz w:val="20"/>
-          <w:szCs w:val="20"/>
-        </w:rPr>
         <w:t xml:space="preserve">Power BI </w:t>
       </w:r>
       <w:r>
-        <w:rPr>
-          <w:sz w:val="20"/>
-          <w:szCs w:val="20"/>
-        </w:rPr>
         <w:t>report</w:t>
       </w:r>
       <w:r>
-        <w:rPr>
-          <w:sz w:val="20"/>
-          <w:szCs w:val="20"/>
-        </w:rPr>
         <w:t>/dashboard</w:t>
       </w:r>
       <w:r>
-        <w:rPr>
-          <w:sz w:val="20"/>
-          <w:szCs w:val="20"/>
-        </w:rPr>
         <w:t xml:space="preserve"> after UPDATE statement from brand = ‘Zara’ to ‘H&amp;M’</w:t>
       </w:r>
     </w:p>
     <w:p>
       <w:pPr>
         <w:pStyle w:val="NoSpacing"/>
-        <w:rPr>
-          <w:sz w:val="20"/>
-          <w:szCs w:val="20"/>
-        </w:rPr>
-      </w:pPr>
-    </w:p>
-    <w:p>
-      <w:pPr>
-        <w:pStyle w:val="NoSpacing"/>
-        <w:rPr>
-          <w:b/>
-          <w:bCs/>
-          <w:sz w:val="20"/>
-          <w:szCs w:val="20"/>
-          <w:u w:val="single"/>
-        </w:rPr>
-      </w:pPr>
-      <w:r>
-        <w:rPr>
-          <w:b/>
-          <w:bCs/>
-          <w:sz w:val="20"/>
-          <w:szCs w:val="20"/>
+      </w:pPr>
+    </w:p>
+    <w:p>
+      <w:pPr>
+        <w:pStyle w:val="NoSpacing"/>
+        <w:rPr>
+          <w:b/>
+          <w:bCs/>
+          <w:u w:val="single"/>
+        </w:rPr>
+      </w:pPr>
+      <w:r>
+        <w:rPr>
+          <w:b/>
+          <w:bCs/>
           <w:u w:val="single"/>
         </w:rPr>
         <w:t xml:space="preserve">Queries: </w:t>
@@ -1237,40 +780,45 @@
           <w:ilvl w:val="0"/>
           <w:numId w:val="8"/>
         </w:numPr>
-        <w:rPr>
-          <w:sz w:val="20"/>
-          <w:szCs w:val="20"/>
-        </w:rPr>
-      </w:pPr>
-      <w:r>
-        <w:rPr>
-          <w:sz w:val="20"/>
-          <w:szCs w:val="20"/>
-        </w:rPr>
+      </w:pPr>
+      <w:r>
         <w:t xml:space="preserve">CREATE </w:t>
       </w:r>
-      <w:r>
-        <w:rPr>
-          <w:sz w:val="20"/>
-          <w:szCs w:val="20"/>
-        </w:rPr>
+      <w:proofErr w:type="gramStart"/>
+      <w:r>
         <w:t xml:space="preserve">DATABASE </w:t>
+      </w:r>
+      <w:r>
+        <w:t xml:space="preserve"> </w:t>
+      </w:r>
+      <w:proofErr w:type="spellStart"/>
+      <w:r>
+        <w:t>PowerBI</w:t>
+      </w:r>
+      <w:proofErr w:type="spellEnd"/>
+      <w:proofErr w:type="gramEnd"/>
+      <w:r>
+        <w:t>;</w:t>
+      </w:r>
+    </w:p>
+    <w:p>
+      <w:pPr>
+        <w:pStyle w:val="NoSpacing"/>
+        <w:numPr>
+          <w:ilvl w:val="0"/>
+          <w:numId w:val="8"/>
+        </w:numPr>
+      </w:pPr>
+      <w:r>
+        <w:t xml:space="preserve">USE </w:t>
       </w:r>
       <w:proofErr w:type="spellStart"/>
       <w:proofErr w:type="gramStart"/>
       <w:r>
-        <w:rPr>
-          <w:sz w:val="20"/>
-          <w:szCs w:val="20"/>
-        </w:rPr>
         <w:t>PowerBI</w:t>
       </w:r>
       <w:proofErr w:type="spellEnd"/>
       <w:r>
-        <w:rPr>
-          <w:sz w:val="20"/>
-          <w:szCs w:val="20"/>
-        </w:rPr>
         <w:t>;</w:t>
       </w:r>
       <w:proofErr w:type="gramEnd"/>
@@ -1282,33 +830,23 @@
           <w:ilvl w:val="0"/>
           <w:numId w:val="8"/>
         </w:numPr>
-        <w:rPr>
-          <w:sz w:val="20"/>
-          <w:szCs w:val="20"/>
-        </w:rPr>
-      </w:pPr>
-      <w:r>
-        <w:rPr>
-          <w:sz w:val="20"/>
-          <w:szCs w:val="20"/>
-        </w:rPr>
-        <w:t xml:space="preserve">USE </w:t>
+      </w:pPr>
+      <w:r>
+        <w:t xml:space="preserve">SELECT * FROM </w:t>
       </w:r>
       <w:proofErr w:type="spellStart"/>
+      <w:r>
+        <w:t>f</w:t>
+      </w:r>
+      <w:r>
+        <w:t>ashion_</w:t>
+      </w:r>
       <w:proofErr w:type="gramStart"/>
       <w:r>
-        <w:rPr>
-          <w:sz w:val="20"/>
-          <w:szCs w:val="20"/>
-        </w:rPr>
-        <w:t>PowerBI</w:t>
+        <w:t>dataset</w:t>
       </w:r>
       <w:proofErr w:type="spellEnd"/>
       <w:r>
-        <w:rPr>
-          <w:sz w:val="20"/>
-          <w:szCs w:val="20"/>
-        </w:rPr>
         <w:t>;</w:t>
       </w:r>
       <w:proofErr w:type="gramEnd"/>
@@ -1320,213 +858,81 @@
           <w:ilvl w:val="0"/>
           <w:numId w:val="8"/>
         </w:numPr>
-        <w:rPr>
-          <w:sz w:val="20"/>
-          <w:szCs w:val="20"/>
-        </w:rPr>
-      </w:pPr>
-      <w:r>
-        <w:rPr>
-          <w:sz w:val="20"/>
-          <w:szCs w:val="20"/>
-        </w:rPr>
-        <w:t xml:space="preserve">SELECT * FROM </w:t>
+      </w:pPr>
+      <w:r>
+        <w:t xml:space="preserve"> </w:t>
+      </w:r>
+      <w:r>
+        <w:t>UPDATE [</w:t>
       </w:r>
       <w:proofErr w:type="spellStart"/>
       <w:r>
-        <w:rPr>
-          <w:sz w:val="20"/>
-          <w:szCs w:val="20"/>
-        </w:rPr>
-        <w:t>f</w:t>
-      </w:r>
-      <w:r>
-        <w:rPr>
-          <w:sz w:val="20"/>
-          <w:szCs w:val="20"/>
-        </w:rPr>
-        <w:t>ashion_</w:t>
-      </w:r>
+        <w:t>dbo</w:t>
+      </w:r>
+      <w:proofErr w:type="spellEnd"/>
       <w:proofErr w:type="gramStart"/>
       <w:r>
-        <w:rPr>
-          <w:sz w:val="20"/>
-          <w:szCs w:val="20"/>
-        </w:rPr>
+        <w:t>].[</w:t>
+      </w:r>
+      <w:proofErr w:type="spellStart"/>
+      <w:proofErr w:type="gramEnd"/>
+      <w:r>
+        <w:t>fashion_</w:t>
+      </w:r>
+      <w:proofErr w:type="gramStart"/>
+      <w:r>
         <w:t>dataset</w:t>
       </w:r>
       <w:proofErr w:type="spellEnd"/>
       <w:r>
-        <w:rPr>
-          <w:sz w:val="20"/>
-          <w:szCs w:val="20"/>
-        </w:rPr>
+        <w:t>]</w:t>
+      </w:r>
+      <w:r>
+        <w:t xml:space="preserve">  --</w:t>
+      </w:r>
+      <w:proofErr w:type="gramEnd"/>
+      <w:r>
+        <w:t xml:space="preserve"> to update the table </w:t>
+      </w:r>
+    </w:p>
+    <w:p>
+      <w:pPr>
+        <w:pStyle w:val="NoSpacing"/>
+        <w:ind w:left="720"/>
+      </w:pPr>
+      <w:r>
+        <w:t>SET brand='H&amp;M'</w:t>
+      </w:r>
+    </w:p>
+    <w:p>
+      <w:pPr>
+        <w:pStyle w:val="NoSpacing"/>
+        <w:ind w:left="720"/>
+      </w:pPr>
+      <w:r>
+        <w:t>WHERE brand='Zara</w:t>
+      </w:r>
+      <w:proofErr w:type="gramStart"/>
+      <w:r>
+        <w:t>'</w:t>
+      </w:r>
+      <w:r>
         <w:t>;</w:t>
       </w:r>
       <w:proofErr w:type="gramEnd"/>
     </w:p>
     <w:p>
       <w:pPr>
-        <w:pStyle w:val="NoSpacing"/>
-        <w:numPr>
-          <w:ilvl w:val="0"/>
-          <w:numId w:val="8"/>
-        </w:numPr>
-        <w:rPr>
-          <w:sz w:val="20"/>
-          <w:szCs w:val="20"/>
-        </w:rPr>
-      </w:pPr>
-      <w:r>
-        <w:rPr>
-          <w:sz w:val="20"/>
-          <w:szCs w:val="20"/>
-        </w:rPr>
-        <w:t xml:space="preserve"> </w:t>
-      </w:r>
-      <w:r>
-        <w:rPr>
-          <w:sz w:val="20"/>
-          <w:szCs w:val="20"/>
-        </w:rPr>
-        <w:t>UPDATE [</w:t>
-      </w:r>
-      <w:proofErr w:type="spellStart"/>
-      <w:r>
-        <w:rPr>
-          <w:sz w:val="20"/>
-          <w:szCs w:val="20"/>
-        </w:rPr>
-        <w:t>dbo</w:t>
-      </w:r>
-      <w:proofErr w:type="spellEnd"/>
-      <w:r>
-        <w:rPr>
-          <w:sz w:val="20"/>
-          <w:szCs w:val="20"/>
-        </w:rPr>
-        <w:t>]. [</w:t>
-      </w:r>
-      <w:proofErr w:type="spellStart"/>
-      <w:r>
-        <w:rPr>
-          <w:sz w:val="20"/>
-          <w:szCs w:val="20"/>
-        </w:rPr>
-        <w:t>fashion_</w:t>
-      </w:r>
-      <w:proofErr w:type="gramStart"/>
-      <w:r>
-        <w:rPr>
-          <w:sz w:val="20"/>
-          <w:szCs w:val="20"/>
-        </w:rPr>
-        <w:t>dataset</w:t>
-      </w:r>
-      <w:proofErr w:type="spellEnd"/>
-      <w:r>
-        <w:rPr>
-          <w:sz w:val="20"/>
-          <w:szCs w:val="20"/>
-        </w:rPr>
-        <w:t>]</w:t>
-      </w:r>
-      <w:r>
-        <w:rPr>
-          <w:sz w:val="20"/>
-          <w:szCs w:val="20"/>
-        </w:rPr>
-        <w:t xml:space="preserve">  </w:t>
-      </w:r>
-      <w:r>
-        <w:rPr>
-          <w:sz w:val="20"/>
-          <w:szCs w:val="20"/>
-        </w:rPr>
-        <w:t xml:space="preserve"> </w:t>
-      </w:r>
-      <w:proofErr w:type="gramEnd"/>
-      <w:r>
-        <w:rPr>
-          <w:sz w:val="20"/>
-          <w:szCs w:val="20"/>
-        </w:rPr>
-        <w:t xml:space="preserve">   </w:t>
-      </w:r>
-      <w:r>
-        <w:rPr>
-          <w:sz w:val="20"/>
-          <w:szCs w:val="20"/>
-        </w:rPr>
-        <w:t xml:space="preserve">-- to update the table </w:t>
-      </w:r>
-    </w:p>
-    <w:p>
-      <w:pPr>
-        <w:pStyle w:val="NoSpacing"/>
-        <w:ind w:left="720"/>
-        <w:rPr>
-          <w:sz w:val="20"/>
-          <w:szCs w:val="20"/>
-        </w:rPr>
-      </w:pPr>
-      <w:r>
-        <w:rPr>
-          <w:sz w:val="20"/>
-          <w:szCs w:val="20"/>
-        </w:rPr>
-        <w:t>SET brand='H&amp;M'</w:t>
-      </w:r>
-    </w:p>
-    <w:p>
-      <w:pPr>
-        <w:pStyle w:val="NoSpacing"/>
-        <w:ind w:left="720"/>
-        <w:rPr>
-          <w:sz w:val="20"/>
-          <w:szCs w:val="20"/>
-        </w:rPr>
-      </w:pPr>
-      <w:r>
-        <w:rPr>
-          <w:sz w:val="20"/>
-          <w:szCs w:val="20"/>
-        </w:rPr>
-        <w:t>WHERE brand='Zara</w:t>
-      </w:r>
-      <w:proofErr w:type="gramStart"/>
-      <w:r>
-        <w:rPr>
-          <w:sz w:val="20"/>
-          <w:szCs w:val="20"/>
-        </w:rPr>
-        <w:t>'</w:t>
-      </w:r>
-      <w:r>
-        <w:rPr>
-          <w:sz w:val="20"/>
-          <w:szCs w:val="20"/>
-        </w:rPr>
-        <w:t>;</w:t>
-      </w:r>
-      <w:proofErr w:type="gramEnd"/>
-    </w:p>
-    <w:p>
-      <w:pPr>
-        <w:rPr>
-          <w:b/>
-          <w:bCs/>
-          <w:sz w:val="20"/>
-          <w:szCs w:val="20"/>
-          <w:u w:val="single"/>
-        </w:rPr>
-      </w:pPr>
-      <w:r>
-        <w:rPr>
-          <w:b/>
-          <w:bCs/>
-          <w:sz w:val="20"/>
-          <w:szCs w:val="20"/>
+        <w:rPr>
+          <w:b/>
+          <w:bCs/>
+          <w:u w:val="single"/>
+        </w:rPr>
+      </w:pPr>
+      <w:r>
+        <w:rPr>
+          <w:b/>
+          <w:bCs/>
           <w:u w:val="single"/>
         </w:rPr>
         <w:t>Custom Measures:</w:t>
@@ -1539,173 +945,86 @@
           <w:ilvl w:val="0"/>
           <w:numId w:val="5"/>
         </w:numPr>
-        <w:rPr>
-          <w:sz w:val="20"/>
-          <w:szCs w:val="20"/>
-        </w:rPr>
-      </w:pPr>
-      <w:r>
-        <w:rPr>
-          <w:sz w:val="20"/>
-          <w:szCs w:val="20"/>
-        </w:rPr>
+      </w:pPr>
+      <w:r>
         <w:t>% Return</w:t>
       </w:r>
     </w:p>
     <w:p>
-      <w:pPr>
-        <w:rPr>
-          <w:sz w:val="20"/>
-          <w:szCs w:val="20"/>
-        </w:rPr>
-      </w:pPr>
-      <w:r>
-        <w:rPr>
-          <w:sz w:val="20"/>
-          <w:szCs w:val="20"/>
-        </w:rPr>
-        <w:t>Formula: % Return = (</w:t>
+      <w:r>
+        <w:t xml:space="preserve">Formula: </w:t>
+      </w:r>
+      <w:r>
+        <w:t>% Return = (</w:t>
       </w:r>
       <w:proofErr w:type="spellStart"/>
       <w:r>
-        <w:rPr>
-          <w:sz w:val="20"/>
-          <w:szCs w:val="20"/>
-        </w:rPr>
         <w:t>countx</w:t>
       </w:r>
       <w:proofErr w:type="spellEnd"/>
       <w:r>
-        <w:rPr>
-          <w:sz w:val="20"/>
-          <w:szCs w:val="20"/>
-        </w:rPr>
         <w:t>(filter(</w:t>
       </w:r>
       <w:proofErr w:type="spellStart"/>
       <w:r>
-        <w:rPr>
-          <w:sz w:val="20"/>
-          <w:szCs w:val="20"/>
-        </w:rPr>
         <w:t>fashion_</w:t>
       </w:r>
       <w:proofErr w:type="gramStart"/>
       <w:r>
-        <w:rPr>
-          <w:sz w:val="20"/>
-          <w:szCs w:val="20"/>
-        </w:rPr>
         <w:t>dataset,fashion</w:t>
       </w:r>
       <w:proofErr w:type="gramEnd"/>
       <w:r>
-        <w:rPr>
-          <w:sz w:val="20"/>
-          <w:szCs w:val="20"/>
-        </w:rPr>
         <w:t>_dataset</w:t>
       </w:r>
       <w:proofErr w:type="spellEnd"/>
       <w:r>
-        <w:rPr>
-          <w:sz w:val="20"/>
-          <w:szCs w:val="20"/>
-        </w:rPr>
         <w:t>[</w:t>
       </w:r>
       <w:proofErr w:type="spellStart"/>
       <w:r>
-        <w:rPr>
-          <w:sz w:val="20"/>
-          <w:szCs w:val="20"/>
-        </w:rPr>
         <w:t>is_returned</w:t>
       </w:r>
       <w:proofErr w:type="spellEnd"/>
       <w:r>
-        <w:rPr>
-          <w:sz w:val="20"/>
-          <w:szCs w:val="20"/>
-        </w:rPr>
         <w:t>] = TRUE()</w:t>
       </w:r>
       <w:proofErr w:type="gramStart"/>
       <w:r>
-        <w:rPr>
-          <w:sz w:val="20"/>
-          <w:szCs w:val="20"/>
-        </w:rPr>
         <w:t>),</w:t>
       </w:r>
       <w:proofErr w:type="spellStart"/>
       <w:r>
-        <w:rPr>
-          <w:sz w:val="20"/>
-          <w:szCs w:val="20"/>
-        </w:rPr>
         <w:t>fashion</w:t>
       </w:r>
       <w:proofErr w:type="gramEnd"/>
       <w:r>
-        <w:rPr>
-          <w:sz w:val="20"/>
-          <w:szCs w:val="20"/>
-        </w:rPr>
         <w:t>_dataset</w:t>
       </w:r>
       <w:proofErr w:type="spellEnd"/>
       <w:r>
-        <w:rPr>
-          <w:sz w:val="20"/>
-          <w:szCs w:val="20"/>
-        </w:rPr>
         <w:t>[</w:t>
       </w:r>
       <w:proofErr w:type="spellStart"/>
       <w:r>
-        <w:rPr>
-          <w:sz w:val="20"/>
-          <w:szCs w:val="20"/>
-        </w:rPr>
         <w:t>product_id</w:t>
       </w:r>
       <w:proofErr w:type="spellEnd"/>
       <w:r>
-        <w:rPr>
-          <w:sz w:val="20"/>
-          <w:szCs w:val="20"/>
-        </w:rPr>
         <w:t>]) / COUNTROWS</w:t>
       </w:r>
       <w:r>
-        <w:rPr>
-          <w:sz w:val="20"/>
-          <w:szCs w:val="20"/>
-        </w:rPr>
         <w:t xml:space="preserve"> </w:t>
       </w:r>
       <w:r>
-        <w:rPr>
-          <w:sz w:val="20"/>
-          <w:szCs w:val="20"/>
-        </w:rPr>
         <w:t>(</w:t>
       </w:r>
       <w:proofErr w:type="spellStart"/>
       <w:r>
-        <w:rPr>
-          <w:sz w:val="20"/>
-          <w:szCs w:val="20"/>
-        </w:rPr>
         <w:t>fashion_dataset</w:t>
       </w:r>
       <w:proofErr w:type="spellEnd"/>
       <w:r>
-        <w:rPr>
-          <w:sz w:val="20"/>
-          <w:szCs w:val="20"/>
-        </w:rPr>
         <w:t>)) * 100</w:t>
       </w:r>
     </w:p>
@@ -1716,123 +1035,60 @@
           <w:ilvl w:val="0"/>
           <w:numId w:val="5"/>
         </w:numPr>
-        <w:rPr>
-          <w:sz w:val="20"/>
-          <w:szCs w:val="20"/>
-        </w:rPr>
-      </w:pPr>
-      <w:r>
-        <w:rPr>
-          <w:sz w:val="20"/>
-          <w:szCs w:val="20"/>
-        </w:rPr>
+      </w:pPr>
+      <w:r>
         <w:t>Avg. Order Value</w:t>
       </w:r>
     </w:p>
     <w:p>
-      <w:pPr>
-        <w:rPr>
-          <w:sz w:val="20"/>
-          <w:szCs w:val="20"/>
-        </w:rPr>
-      </w:pPr>
-      <w:r>
-        <w:rPr>
-          <w:sz w:val="20"/>
-          <w:szCs w:val="20"/>
-        </w:rPr>
-        <w:t>Formula: Avg. Order Value = SUM</w:t>
-      </w:r>
-      <w:r>
-        <w:rPr>
-          <w:sz w:val="20"/>
-          <w:szCs w:val="20"/>
-        </w:rPr>
+      <w:r>
+        <w:t xml:space="preserve">Formula: </w:t>
+      </w:r>
+      <w:r>
+        <w:t>Avg. Order Value = SUM</w:t>
+      </w:r>
+      <w:r>
         <w:t xml:space="preserve"> </w:t>
       </w:r>
       <w:r>
-        <w:rPr>
-          <w:sz w:val="20"/>
-          <w:szCs w:val="20"/>
-        </w:rPr>
         <w:t>(</w:t>
       </w:r>
       <w:proofErr w:type="spellStart"/>
       <w:r>
-        <w:rPr>
-          <w:sz w:val="20"/>
-          <w:szCs w:val="20"/>
-        </w:rPr>
         <w:t>fashion_dataset</w:t>
       </w:r>
       <w:proofErr w:type="spellEnd"/>
       <w:r>
-        <w:rPr>
-          <w:sz w:val="20"/>
-          <w:szCs w:val="20"/>
-        </w:rPr>
         <w:t>[</w:t>
       </w:r>
       <w:proofErr w:type="spellStart"/>
       <w:r>
-        <w:rPr>
-          <w:sz w:val="20"/>
-          <w:szCs w:val="20"/>
-        </w:rPr>
         <w:t>current_price</w:t>
       </w:r>
       <w:proofErr w:type="spellEnd"/>
       <w:r>
-        <w:rPr>
-          <w:sz w:val="20"/>
-          <w:szCs w:val="20"/>
-        </w:rPr>
         <w:t>]) / COUNT</w:t>
       </w:r>
       <w:r>
-        <w:rPr>
-          <w:sz w:val="20"/>
-          <w:szCs w:val="20"/>
-        </w:rPr>
         <w:t xml:space="preserve"> </w:t>
       </w:r>
       <w:r>
-        <w:rPr>
-          <w:sz w:val="20"/>
-          <w:szCs w:val="20"/>
-        </w:rPr>
         <w:t>(</w:t>
       </w:r>
       <w:proofErr w:type="spellStart"/>
       <w:r>
-        <w:rPr>
-          <w:sz w:val="20"/>
-          <w:szCs w:val="20"/>
-        </w:rPr>
         <w:t>fashion_dataset</w:t>
       </w:r>
       <w:proofErr w:type="spellEnd"/>
       <w:r>
-        <w:rPr>
-          <w:sz w:val="20"/>
-          <w:szCs w:val="20"/>
-        </w:rPr>
         <w:t>[</w:t>
       </w:r>
       <w:proofErr w:type="spellStart"/>
       <w:r>
-        <w:rPr>
-          <w:sz w:val="20"/>
-          <w:szCs w:val="20"/>
-        </w:rPr>
         <w:t>product_id</w:t>
       </w:r>
       <w:proofErr w:type="spellEnd"/>
       <w:r>
-        <w:rPr>
-          <w:sz w:val="20"/>
-          <w:szCs w:val="20"/>
-        </w:rPr>
         <w:t>])</w:t>
       </w:r>
     </w:p>
@@ -1841,19 +1097,16 @@
         <w:rPr>
           <w:b/>
           <w:bCs/>
-          <w:sz w:val="20"/>
-          <w:szCs w:val="20"/>
-          <w:u w:val="single"/>
-        </w:rPr>
-      </w:pPr>
-      <w:r>
-        <w:rPr>
-          <w:b/>
-          <w:bCs/>
-          <w:sz w:val="20"/>
-          <w:szCs w:val="20"/>
-          <w:u w:val="single"/>
-        </w:rPr>
+          <w:u w:val="single"/>
+        </w:rPr>
+      </w:pPr>
+      <w:r>
+        <w:rPr>
+          <w:b/>
+          <w:bCs/>
+          <w:u w:val="single"/>
+        </w:rPr>
+        <w:lastRenderedPageBreak/>
         <w:t>Visuals used:</w:t>
       </w:r>
     </w:p>
@@ -1864,16 +1117,8 @@
           <w:ilvl w:val="0"/>
           <w:numId w:val="6"/>
         </w:numPr>
-        <w:rPr>
-          <w:sz w:val="20"/>
-          <w:szCs w:val="20"/>
-        </w:rPr>
-      </w:pPr>
-      <w:r>
-        <w:rPr>
-          <w:sz w:val="20"/>
-          <w:szCs w:val="20"/>
-        </w:rPr>
+      </w:pPr>
+      <w:r>
         <w:t xml:space="preserve">Stacked bar chart </w:t>
       </w:r>
     </w:p>
@@ -1884,16 +1129,8 @@
           <w:ilvl w:val="0"/>
           <w:numId w:val="6"/>
         </w:numPr>
-        <w:rPr>
-          <w:sz w:val="20"/>
-          <w:szCs w:val="20"/>
-        </w:rPr>
-      </w:pPr>
-      <w:r>
-        <w:rPr>
-          <w:sz w:val="20"/>
-          <w:szCs w:val="20"/>
-        </w:rPr>
+      </w:pPr>
+      <w:r>
         <w:t xml:space="preserve">Clustered column chart </w:t>
       </w:r>
     </w:p>
@@ -1904,16 +1141,8 @@
           <w:ilvl w:val="0"/>
           <w:numId w:val="6"/>
         </w:numPr>
-        <w:rPr>
-          <w:sz w:val="20"/>
-          <w:szCs w:val="20"/>
-        </w:rPr>
-      </w:pPr>
-      <w:r>
-        <w:rPr>
-          <w:sz w:val="20"/>
-          <w:szCs w:val="20"/>
-        </w:rPr>
+      </w:pPr>
+      <w:r>
         <w:t xml:space="preserve">Line chart </w:t>
       </w:r>
     </w:p>
@@ -1924,16 +1153,8 @@
           <w:ilvl w:val="0"/>
           <w:numId w:val="6"/>
         </w:numPr>
-        <w:rPr>
-          <w:sz w:val="20"/>
-          <w:szCs w:val="20"/>
-        </w:rPr>
-      </w:pPr>
-      <w:r>
-        <w:rPr>
-          <w:sz w:val="20"/>
-          <w:szCs w:val="20"/>
-        </w:rPr>
+      </w:pPr>
+      <w:r>
         <w:t>Pie chart</w:t>
       </w:r>
     </w:p>
@@ -1944,16 +1165,8 @@
           <w:ilvl w:val="0"/>
           <w:numId w:val="6"/>
         </w:numPr>
-        <w:rPr>
-          <w:sz w:val="20"/>
-          <w:szCs w:val="20"/>
-        </w:rPr>
-      </w:pPr>
-      <w:r>
-        <w:rPr>
-          <w:sz w:val="20"/>
-          <w:szCs w:val="20"/>
-        </w:rPr>
+      </w:pPr>
+      <w:r>
         <w:t>Ribbon chart</w:t>
       </w:r>
     </w:p>
@@ -1964,16 +1177,8 @@
           <w:ilvl w:val="0"/>
           <w:numId w:val="6"/>
         </w:numPr>
-        <w:rPr>
-          <w:sz w:val="20"/>
-          <w:szCs w:val="20"/>
-        </w:rPr>
-      </w:pPr>
-      <w:r>
-        <w:rPr>
-          <w:sz w:val="20"/>
-          <w:szCs w:val="20"/>
-        </w:rPr>
+      </w:pPr>
+      <w:r>
         <w:t>Card(s)</w:t>
       </w:r>
     </w:p>
@@ -1984,16 +1189,8 @@
           <w:ilvl w:val="0"/>
           <w:numId w:val="6"/>
         </w:numPr>
-        <w:rPr>
-          <w:sz w:val="20"/>
-          <w:szCs w:val="20"/>
-        </w:rPr>
-      </w:pPr>
-      <w:r>
-        <w:rPr>
-          <w:sz w:val="20"/>
-          <w:szCs w:val="20"/>
-        </w:rPr>
+      </w:pPr>
+      <w:r>
         <w:t>Slicer</w:t>
       </w:r>
     </w:p>
@@ -2002,20 +1199,24 @@
         <w:rPr>
           <w:b/>
           <w:bCs/>
-          <w:sz w:val="20"/>
-          <w:szCs w:val="20"/>
-          <w:u w:val="single"/>
-        </w:rPr>
-      </w:pPr>
-      <w:r>
-        <w:rPr>
-          <w:b/>
-          <w:bCs/>
-          <w:sz w:val="20"/>
-          <w:szCs w:val="20"/>
-          <w:u w:val="single"/>
-        </w:rPr>
-        <w:t>Power BI Pages created:</w:t>
+          <w:u w:val="single"/>
+        </w:rPr>
+      </w:pPr>
+      <w:r>
+        <w:rPr>
+          <w:b/>
+          <w:bCs/>
+          <w:u w:val="single"/>
+        </w:rPr>
+        <w:t xml:space="preserve">Power BI </w:t>
+      </w:r>
+      <w:r>
+        <w:rPr>
+          <w:b/>
+          <w:bCs/>
+          <w:u w:val="single"/>
+        </w:rPr>
+        <w:t>Pages created:</w:t>
       </w:r>
     </w:p>
     <w:p>
@@ -2025,16 +1226,8 @@
           <w:ilvl w:val="0"/>
           <w:numId w:val="7"/>
         </w:numPr>
-        <w:rPr>
-          <w:sz w:val="20"/>
-          <w:szCs w:val="20"/>
-        </w:rPr>
-      </w:pPr>
-      <w:r>
-        <w:rPr>
-          <w:sz w:val="20"/>
-          <w:szCs w:val="20"/>
-        </w:rPr>
+      </w:pPr>
+      <w:r>
         <w:t>SALES PERFORMANCE AND REVENUE</w:t>
       </w:r>
     </w:p>
@@ -2045,16 +1238,8 @@
           <w:ilvl w:val="0"/>
           <w:numId w:val="7"/>
         </w:numPr>
-        <w:rPr>
-          <w:sz w:val="20"/>
-          <w:szCs w:val="20"/>
-        </w:rPr>
-      </w:pPr>
-      <w:r>
-        <w:rPr>
-          <w:sz w:val="20"/>
-          <w:szCs w:val="20"/>
-        </w:rPr>
+      </w:pPr>
+      <w:r>
         <w:t>CUSTOMER BEHAVIOR &amp; RETURNS</w:t>
       </w:r>
     </w:p>
@@ -2065,62 +1250,31 @@
           <w:ilvl w:val="0"/>
           <w:numId w:val="7"/>
         </w:numPr>
-        <w:rPr>
-          <w:sz w:val="20"/>
-          <w:szCs w:val="20"/>
-        </w:rPr>
-      </w:pPr>
-      <w:r>
-        <w:rPr>
-          <w:sz w:val="20"/>
-          <w:szCs w:val="20"/>
-        </w:rPr>
+      </w:pPr>
+      <w:r>
         <w:t>INVENTORY &amp; CATEGORY PERFORMANCE</w:t>
       </w:r>
     </w:p>
     <w:p>
       <w:pPr>
         <w:rPr>
-          <w:sz w:val="20"/>
-          <w:szCs w:val="20"/>
-        </w:rPr>
-      </w:pPr>
-    </w:p>
-    <w:p>
-      <w:pPr>
-        <w:rPr>
-          <w:sz w:val="20"/>
-          <w:szCs w:val="20"/>
-        </w:rPr>
-      </w:pPr>
-    </w:p>
-    <w:p>
-      <w:pPr>
-        <w:rPr>
-          <w:b/>
-          <w:bCs/>
-          <w:sz w:val="20"/>
-          <w:szCs w:val="20"/>
-          <w:u w:val="single"/>
-        </w:rPr>
-      </w:pPr>
-      <w:r>
-        <w:rPr>
-          <w:b/>
-          <w:bCs/>
-          <w:sz w:val="20"/>
-          <w:szCs w:val="20"/>
-          <w:u w:val="single"/>
-        </w:rPr>
-        <w:lastRenderedPageBreak/>
+          <w:b/>
+          <w:bCs/>
+          <w:u w:val="single"/>
+        </w:rPr>
+      </w:pPr>
+      <w:r>
+        <w:rPr>
+          <w:b/>
+          <w:bCs/>
+          <w:u w:val="single"/>
+        </w:rPr>
         <w:t xml:space="preserve">Page1: </w:t>
       </w:r>
       <w:r>
         <w:rPr>
           <w:b/>
           <w:bCs/>
-          <w:sz w:val="20"/>
-          <w:szCs w:val="20"/>
           <w:u w:val="single"/>
         </w:rPr>
         <w:t>SALES PERFORMANCE AND REVENUE</w:t>
@@ -2129,25 +1283,15 @@
         <w:rPr>
           <w:b/>
           <w:bCs/>
-          <w:sz w:val="20"/>
-          <w:szCs w:val="20"/>
           <w:u w:val="single"/>
         </w:rPr>
         <w:t xml:space="preserve"> </w:t>
       </w:r>
     </w:p>
     <w:p>
-      <w:pPr>
-        <w:rPr>
-          <w:sz w:val="20"/>
-          <w:szCs w:val="20"/>
-        </w:rPr>
-      </w:pPr>
       <w:r>
         <w:rPr>
           <w:noProof/>
-          <w:sz w:val="20"/>
-          <w:szCs w:val="20"/>
         </w:rPr>
         <w:drawing>
           <wp:inline distT="0" distB="0" distL="0" distR="0" wp14:anchorId="0A1B36D0" wp14:editId="0C156F36">
@@ -2199,34 +1343,76 @@
         <w:rPr>
           <w:b/>
           <w:bCs/>
-          <w:sz w:val="20"/>
-          <w:szCs w:val="20"/>
-          <w:u w:val="single"/>
-        </w:rPr>
-      </w:pPr>
-      <w:r>
-        <w:rPr>
-          <w:b/>
-          <w:bCs/>
-          <w:sz w:val="20"/>
-          <w:szCs w:val="20"/>
-          <w:u w:val="single"/>
-        </w:rPr>
-        <w:t>Page2: CUSTOMER BEHAVIOR &amp; RETURNS</w:t>
-      </w:r>
-    </w:p>
-    <w:p>
-      <w:pPr>
-        <w:rPr>
-          <w:sz w:val="20"/>
-          <w:szCs w:val="20"/>
-        </w:rPr>
-      </w:pPr>
+          <w:u w:val="single"/>
+        </w:rPr>
+      </w:pPr>
+    </w:p>
+    <w:p>
+      <w:pPr>
+        <w:rPr>
+          <w:b/>
+          <w:bCs/>
+          <w:u w:val="single"/>
+        </w:rPr>
+      </w:pPr>
+    </w:p>
+    <w:p>
+      <w:pPr>
+        <w:rPr>
+          <w:b/>
+          <w:bCs/>
+          <w:u w:val="single"/>
+        </w:rPr>
+      </w:pPr>
+    </w:p>
+    <w:p>
+      <w:pPr>
+        <w:rPr>
+          <w:b/>
+          <w:bCs/>
+          <w:u w:val="single"/>
+        </w:rPr>
+      </w:pPr>
+    </w:p>
+    <w:p>
+      <w:pPr>
+        <w:rPr>
+          <w:b/>
+          <w:bCs/>
+          <w:u w:val="single"/>
+        </w:rPr>
+      </w:pPr>
+    </w:p>
+    <w:p>
+      <w:pPr>
+        <w:rPr>
+          <w:b/>
+          <w:bCs/>
+          <w:u w:val="single"/>
+        </w:rPr>
+      </w:pPr>
+      <w:r>
+        <w:rPr>
+          <w:b/>
+          <w:bCs/>
+          <w:u w:val="single"/>
+        </w:rPr>
+        <w:lastRenderedPageBreak/>
+        <w:t>Page</w:t>
+      </w:r>
+      <w:r>
+        <w:rPr>
+          <w:b/>
+          <w:bCs/>
+          <w:u w:val="single"/>
+        </w:rPr>
+        <w:t>2: CUSTOMER BEHAVIOR &amp; RETURNS</w:t>
+      </w:r>
+    </w:p>
+    <w:p>
       <w:r>
         <w:rPr>
           <w:noProof/>
-          <w:sz w:val="20"/>
-          <w:szCs w:val="20"/>
         </w:rPr>
         <w:drawing>
           <wp:inline distT="0" distB="0" distL="0" distR="0" wp14:anchorId="7D75B826" wp14:editId="24FBEB10">
@@ -2278,57 +1464,22 @@
         <w:rPr>
           <w:b/>
           <w:bCs/>
-          <w:sz w:val="20"/>
-          <w:szCs w:val="20"/>
-          <w:u w:val="single"/>
-        </w:rPr>
-      </w:pPr>
-    </w:p>
-    <w:p>
-      <w:pPr>
-        <w:rPr>
-          <w:b/>
-          <w:bCs/>
-          <w:sz w:val="20"/>
-          <w:szCs w:val="20"/>
-          <w:u w:val="single"/>
-        </w:rPr>
-      </w:pPr>
-    </w:p>
-    <w:p>
-      <w:pPr>
-        <w:rPr>
-          <w:b/>
-          <w:bCs/>
-          <w:sz w:val="20"/>
-          <w:szCs w:val="20"/>
-          <w:u w:val="single"/>
-        </w:rPr>
-      </w:pPr>
-      <w:r>
-        <w:rPr>
-          <w:b/>
-          <w:bCs/>
-          <w:sz w:val="20"/>
-          <w:szCs w:val="20"/>
-          <w:u w:val="single"/>
-        </w:rPr>
-        <w:lastRenderedPageBreak/>
+          <w:u w:val="single"/>
+        </w:rPr>
+      </w:pPr>
+      <w:r>
+        <w:rPr>
+          <w:b/>
+          <w:bCs/>
+          <w:u w:val="single"/>
+        </w:rPr>
         <w:t>Page3: INVENTORY &amp; CATEGORY PERFORMANCE</w:t>
       </w:r>
     </w:p>
     <w:p>
-      <w:pPr>
-        <w:rPr>
-          <w:sz w:val="20"/>
-          <w:szCs w:val="20"/>
-        </w:rPr>
-      </w:pPr>
       <w:r>
         <w:rPr>
           <w:noProof/>
-          <w:sz w:val="20"/>
-          <w:szCs w:val="20"/>
         </w:rPr>
         <w:drawing>
           <wp:inline distT="0" distB="0" distL="0" distR="0" wp14:anchorId="7DF33907" wp14:editId="4BCFE6E7">
@@ -2375,39 +1526,56 @@
         </w:drawing>
       </w:r>
     </w:p>
-    <w:p>
-      <w:pPr>
-        <w:rPr>
-          <w:b/>
-          <w:bCs/>
-          <w:sz w:val="20"/>
-          <w:szCs w:val="20"/>
-          <w:u w:val="single"/>
-        </w:rPr>
-      </w:pPr>
-      <w:r>
-        <w:rPr>
-          <w:b/>
-          <w:bCs/>
-          <w:sz w:val="20"/>
-          <w:szCs w:val="20"/>
+    <w:p/>
+    <w:p>
+      <w:pPr>
+        <w:rPr>
+          <w:b/>
+          <w:bCs/>
+          <w:u w:val="single"/>
+        </w:rPr>
+      </w:pPr>
+      <w:r>
+        <w:rPr>
+          <w:b/>
+          <w:bCs/>
+          <w:u w:val="single"/>
+        </w:rPr>
+        <w:lastRenderedPageBreak/>
+        <w:t>Data Model in Power BI:</w:t>
+      </w:r>
+    </w:p>
+    <w:p>
+      <w:r>
+        <w:object w:dxaOrig="1541" w:dyaOrig="998" w14:anchorId="2B823DED">
+          <v:shape id="_x0000_i1027" type="#_x0000_t75" style="width:77pt;height:50.1pt" o:ole="">
+            <v:imagedata r:id="rId12" o:title=""/>
+          </v:shape>
+          <o:OLEObject Type="Embed" ProgID="Package" ShapeID="_x0000_i1027" DrawAspect="Icon" ObjectID="_1833942679" r:id="rId13"/>
+        </w:object>
+      </w:r>
+    </w:p>
+    <w:p>
+      <w:pPr>
+        <w:rPr>
+          <w:b/>
+          <w:bCs/>
+          <w:u w:val="single"/>
+        </w:rPr>
+      </w:pPr>
+      <w:r>
+        <w:rPr>
+          <w:b/>
+          <w:bCs/>
           <w:u w:val="single"/>
         </w:rPr>
         <w:t>SQL Server:</w:t>
       </w:r>
     </w:p>
     <w:p>
-      <w:pPr>
-        <w:rPr>
-          <w:sz w:val="20"/>
-          <w:szCs w:val="20"/>
-        </w:rPr>
-      </w:pPr>
       <w:r>
         <w:rPr>
           <w:noProof/>
-          <w:sz w:val="20"/>
-          <w:szCs w:val="20"/>
         </w:rPr>
         <w:drawing>
           <wp:inline distT="0" distB="0" distL="0" distR="0" wp14:anchorId="0236B912" wp14:editId="431DC1EC">
@@ -2425,7 +1593,7 @@
                     <pic:cNvPicPr/>
                   </pic:nvPicPr>
                   <pic:blipFill>
-                    <a:blip r:embed="rId12"/>
+                    <a:blip r:embed="rId14"/>
                     <a:stretch>
                       <a:fillRect/>
                     </a:stretch>
@@ -2454,40 +1622,11 @@
         </w:drawing>
       </w:r>
     </w:p>
-    <w:p>
-      <w:pPr>
-        <w:rPr>
-          <w:sz w:val="20"/>
-          <w:szCs w:val="20"/>
-        </w:rPr>
-      </w:pPr>
-      <w:r>
-        <w:rPr>
-          <w:sz w:val="20"/>
-          <w:szCs w:val="20"/>
-        </w:rPr>
-        <w:t>---------------------------------------------------------</w:t>
-      </w:r>
-      <w:r>
-        <w:rPr>
-          <w:sz w:val="20"/>
-          <w:szCs w:val="20"/>
-        </w:rPr>
-        <w:t>-------------</w:t>
-      </w:r>
-      <w:r>
-        <w:rPr>
-          <w:sz w:val="20"/>
-          <w:szCs w:val="20"/>
-        </w:rPr>
-        <w:t>--END---------------------------------------------------</w:t>
-      </w:r>
-      <w:r>
-        <w:rPr>
-          <w:sz w:val="20"/>
-          <w:szCs w:val="20"/>
-        </w:rPr>
-        <w:t>-----------</w:t>
+    <w:p/>
+    <w:p/>
+    <w:p>
+      <w:r>
+        <w:t>-----------------------------------------------------------END---------------------------------------------------</w:t>
       </w:r>
     </w:p>
     <w:sectPr>

</xml_diff>